<commit_message>
parcial 2 mejor editado
</commit_message>
<xml_diff>
--- a/3_paciales/2_parcial/ejemplo_parcial_2_fecha_9_de_abril_jueves.docx
+++ b/3_paciales/2_parcial/ejemplo_parcial_2_fecha_9_de_abril_jueves.docx
@@ -38,22 +38,26 @@
     <w:p>
       <w:pPr>
         <w:rPr>
+          <w:b/>
+          <w:bCs/>
           <w:lang w:val="es-ES"/>
         </w:rPr>
       </w:pPr>
-    </w:p>
-    <w:p>
-      <w:pPr>
-        <w:rPr>
+      <w:r>
+        <w:rPr>
+          <w:b/>
+          <w:bCs/>
           <w:lang w:val="es-ES"/>
         </w:rPr>
-      </w:pPr>
-      <w:r>
+        <w:t xml:space="preserve">Componente teórico </w:t>
+      </w:r>
+    </w:p>
+    <w:p>
+      <w:pPr>
         <w:rPr>
           <w:lang w:val="es-ES"/>
         </w:rPr>
-        <w:t xml:space="preserve">Componente teórico </w:t>
-      </w:r>
+      </w:pPr>
     </w:p>
     <w:p>
       <w:pPr>
@@ -61,17 +65,79 @@
           <w:lang w:val="es-ES"/>
         </w:rPr>
       </w:pPr>
-    </w:p>
-    <w:p>
-      <w:pPr>
+      <w:r>
         <w:rPr>
           <w:lang w:val="es-ES"/>
         </w:rPr>
-      </w:pPr>
-      <w:r>
+        <w:t>Preguntas con respecto al capítulo 4</w:t>
+      </w:r>
+    </w:p>
+    <w:p>
+      <w:pPr>
         <w:rPr>
           <w:lang w:val="es-ES"/>
         </w:rPr>
+      </w:pPr>
+      <w:r>
+        <w:rPr>
+          <w:lang w:val="es-ES"/>
+        </w:rPr>
+        <w:t>Preguntas con respecto al capítulo 5</w:t>
+      </w:r>
+    </w:p>
+    <w:p>
+      <w:pPr>
+        <w:rPr>
+          <w:lang w:val="es-ES"/>
+        </w:rPr>
+      </w:pPr>
+      <w:r>
+        <w:rPr>
+          <w:lang w:val="es-ES"/>
+        </w:rPr>
+        <w:t>Preguntas con respecto al capítulo 6</w:t>
+      </w:r>
+    </w:p>
+    <w:p>
+      <w:pPr>
+        <w:rPr>
+          <w:lang w:val="es-ES"/>
+        </w:rPr>
+      </w:pPr>
+      <w:r>
+        <w:rPr>
+          <w:lang w:val="es-ES"/>
+        </w:rPr>
+        <w:t xml:space="preserve">Máximo 10 preguntas en el teórico y el práctico. </w:t>
+      </w:r>
+    </w:p>
+    <w:p>
+      <w:pPr>
+        <w:rPr>
+          <w:b/>
+          <w:bCs/>
+          <w:lang w:val="es-ES"/>
+        </w:rPr>
+      </w:pPr>
+      <w:r>
+        <w:rPr>
+          <w:b/>
+          <w:bCs/>
+          <w:lang w:val="es-ES"/>
+        </w:rPr>
+        <w:t xml:space="preserve">Componente práctico. </w:t>
+      </w:r>
+    </w:p>
+    <w:p>
+      <w:pPr>
+        <w:rPr>
+          <w:lang w:val="es-ES"/>
+        </w:rPr>
+      </w:pPr>
+      <w:r>
+        <w:rPr>
+          <w:lang w:val="es-ES"/>
+        </w:rPr>
         <w:t>Preguntas con respecto al capítulo 4</w:t>
       </w:r>
     </w:p>
@@ -85,127 +151,2495 @@
         <w:rPr>
           <w:lang w:val="es-ES"/>
         </w:rPr>
-        <w:t xml:space="preserve">Preguntas con respecto al capítulo </w:t>
-      </w:r>
-      <w:r>
+        <w:t>Preguntas con respecto al capítulo 5</w:t>
+      </w:r>
+    </w:p>
+    <w:p>
+      <w:pPr>
         <w:rPr>
           <w:lang w:val="es-ES"/>
         </w:rPr>
-        <w:t>5</w:t>
-      </w:r>
-    </w:p>
-    <w:p>
-      <w:pPr>
+      </w:pPr>
+      <w:r>
         <w:rPr>
           <w:lang w:val="es-ES"/>
         </w:rPr>
-      </w:pPr>
-      <w:r>
-        <w:rPr>
-          <w:lang w:val="es-ES"/>
-        </w:rPr>
-        <w:t xml:space="preserve">Preguntas con respecto al capítulo </w:t>
-      </w:r>
-      <w:r>
-        <w:rPr>
-          <w:lang w:val="es-ES"/>
-        </w:rPr>
-        <w:t>6</w:t>
-      </w:r>
-    </w:p>
-    <w:p>
-      <w:pPr>
-        <w:rPr>
-          <w:lang w:val="es-ES"/>
-        </w:rPr>
-      </w:pPr>
-    </w:p>
-    <w:p>
-      <w:pPr>
-        <w:rPr>
-          <w:lang w:val="es-ES"/>
-        </w:rPr>
-      </w:pPr>
-    </w:p>
-    <w:p>
-      <w:pPr>
-        <w:rPr>
-          <w:lang w:val="es-ES"/>
-        </w:rPr>
-      </w:pPr>
-    </w:p>
-    <w:p>
-      <w:pPr>
-        <w:rPr>
-          <w:lang w:val="es-ES"/>
-        </w:rPr>
-      </w:pPr>
-      <w:r>
-        <w:rPr>
-          <w:lang w:val="es-ES"/>
-        </w:rPr>
-        <w:t xml:space="preserve">Máximo 10 preguntas en el teórico y el práctico. </w:t>
-      </w:r>
-    </w:p>
-    <w:p>
-      <w:pPr>
-        <w:rPr>
-          <w:lang w:val="es-ES"/>
-        </w:rPr>
-      </w:pPr>
-      <w:r>
-        <w:rPr>
-          <w:lang w:val="es-ES"/>
-        </w:rPr>
-        <w:t xml:space="preserve">Componente práctico. </w:t>
-      </w:r>
-    </w:p>
-    <w:p>
-      <w:pPr>
-        <w:rPr>
-          <w:lang w:val="es-ES"/>
-        </w:rPr>
-      </w:pPr>
-      <w:r>
-        <w:rPr>
-          <w:lang w:val="es-ES"/>
-        </w:rPr>
-        <w:t>Preguntas con respecto al capítulo 4</w:t>
-      </w:r>
-    </w:p>
-    <w:p>
-      <w:pPr>
-        <w:rPr>
-          <w:lang w:val="es-ES"/>
-        </w:rPr>
-      </w:pPr>
-      <w:r>
-        <w:rPr>
-          <w:lang w:val="es-ES"/>
-        </w:rPr>
-        <w:t>Preguntas con respecto al capítulo 5</w:t>
-      </w:r>
-    </w:p>
-    <w:p>
-      <w:pPr>
-        <w:rPr>
-          <w:lang w:val="es-ES"/>
-        </w:rPr>
-      </w:pPr>
-      <w:r>
-        <w:rPr>
-          <w:lang w:val="es-ES"/>
-        </w:rPr>
         <w:t>Preguntas con respecto al capítulo 6</w:t>
       </w:r>
     </w:p>
     <w:p>
-      <w:pPr>
-        <w:rPr>
-          <w:lang w:val="es-ES"/>
-        </w:rPr>
-      </w:pPr>
-    </w:p>
+      <w:r>
+        <w:t xml:space="preserve">Diseñar un examen para matemáticos requiere un enfoque que no solo evalúe la sintaxis, sino la </w:t>
+      </w:r>
+      <w:r>
+        <w:rPr>
+          <w:b/>
+          <w:bCs/>
+        </w:rPr>
+        <w:t>lógica algorítmica</w:t>
+      </w:r>
+      <w:r>
+        <w:t xml:space="preserve"> y la capacidad de traducir conceptos abstractos (como los de lógica proposicional o cálculo) en soluciones computacionales eficientes.</w:t>
+      </w:r>
+    </w:p>
+    <w:p/>
+    <w:p>
+      <w:pPr>
+        <w:rPr>
+          <w:b/>
+          <w:bCs/>
+        </w:rPr>
+      </w:pPr>
+      <w:r>
+        <w:rPr>
+          <w:b/>
+          <w:bCs/>
+        </w:rPr>
+        <w:t xml:space="preserve">Examen Parcial: </w:t>
+      </w:r>
+      <w:r>
+        <w:rPr>
+          <w:b/>
+          <w:bCs/>
+        </w:rPr>
+        <w:t>Fundamentos de Programación con</w:t>
+      </w:r>
+      <w:r>
+        <w:rPr>
+          <w:b/>
+          <w:bCs/>
+        </w:rPr>
+        <w:t xml:space="preserve"> Python para Matemáticos</w:t>
+      </w:r>
+    </w:p>
+    <w:p>
+      <w:r>
+        <w:rPr>
+          <w:b/>
+          <w:bCs/>
+        </w:rPr>
+        <w:t>Curso:</w:t>
+      </w:r>
+      <w:r>
+        <w:t xml:space="preserve"> </w:t>
+      </w:r>
+      <w:r>
+        <w:t>Fundamentos de Programación</w:t>
+      </w:r>
+    </w:p>
+    <w:p>
+      <w:r>
+        <w:rPr>
+          <w:b/>
+          <w:bCs/>
+        </w:rPr>
+        <w:t>Temas:</w:t>
+      </w:r>
+      <w:r>
+        <w:t xml:space="preserve"> Condicionales, Bucles (</w:t>
+      </w:r>
+      <w:proofErr w:type="spellStart"/>
+      <w:r>
+        <w:t>for</w:t>
+      </w:r>
+      <w:proofErr w:type="spellEnd"/>
+      <w:r>
+        <w:t xml:space="preserve">, </w:t>
+      </w:r>
+      <w:proofErr w:type="spellStart"/>
+      <w:r>
+        <w:t>while</w:t>
+      </w:r>
+      <w:proofErr w:type="spellEnd"/>
+      <w:r>
+        <w:t>) y Funciones de Usuario.</w:t>
+      </w:r>
+    </w:p>
+    <w:p/>
+    <w:p>
+      <w:pPr>
+        <w:rPr>
+          <w:b/>
+          <w:bCs/>
+        </w:rPr>
+      </w:pPr>
+      <w:r>
+        <w:rPr>
+          <w:b/>
+          <w:bCs/>
+        </w:rPr>
+        <w:t>Sección I: Componente Teórico (Conceptos y Lógica)</w:t>
+      </w:r>
+    </w:p>
+    <w:p>
+      <w:r>
+        <w:rPr>
+          <w:i/>
+          <w:iCs/>
+        </w:rPr>
+        <w:t xml:space="preserve">Esta sección evalúa la comprensión de las estructuras de control y la </w:t>
+      </w:r>
+      <w:proofErr w:type="spellStart"/>
+      <w:r>
+        <w:rPr>
+          <w:i/>
+          <w:iCs/>
+        </w:rPr>
+        <w:t>modularización</w:t>
+      </w:r>
+      <w:proofErr w:type="spellEnd"/>
+      <w:r>
+        <w:rPr>
+          <w:i/>
+          <w:iCs/>
+        </w:rPr>
+        <w:t>.</w:t>
+      </w:r>
+    </w:p>
+    <w:p>
+      <w:r>
+        <w:rPr>
+          <w:b/>
+          <w:bCs/>
+        </w:rPr>
+        <w:t xml:space="preserve">1. ¿Cuál es la diferencia fundamental entre un bucle </w:t>
+      </w:r>
+      <w:proofErr w:type="spellStart"/>
+      <w:r>
+        <w:rPr>
+          <w:b/>
+          <w:bCs/>
+        </w:rPr>
+        <w:t>for</w:t>
+      </w:r>
+      <w:proofErr w:type="spellEnd"/>
+      <w:r>
+        <w:rPr>
+          <w:b/>
+          <w:bCs/>
+        </w:rPr>
+        <w:t xml:space="preserve"> y un bucle </w:t>
+      </w:r>
+      <w:proofErr w:type="spellStart"/>
+      <w:r>
+        <w:rPr>
+          <w:b/>
+          <w:bCs/>
+        </w:rPr>
+        <w:t>while</w:t>
+      </w:r>
+      <w:proofErr w:type="spellEnd"/>
+      <w:r>
+        <w:rPr>
+          <w:b/>
+          <w:bCs/>
+        </w:rPr>
+        <w:t xml:space="preserve"> en términos de terminación?</w:t>
+      </w:r>
+    </w:p>
+    <w:p>
+      <w:pPr>
+        <w:numPr>
+          <w:ilvl w:val="0"/>
+          <w:numId w:val="1"/>
+        </w:numPr>
+      </w:pPr>
+      <w:r>
+        <w:rPr>
+          <w:b/>
+          <w:bCs/>
+        </w:rPr>
+        <w:t>Respuesta:</w:t>
+      </w:r>
+      <w:r>
+        <w:t xml:space="preserve"> El </w:t>
+      </w:r>
+      <w:proofErr w:type="spellStart"/>
+      <w:r>
+        <w:t>for</w:t>
+      </w:r>
+      <w:proofErr w:type="spellEnd"/>
+      <w:r>
+        <w:t xml:space="preserve"> se utiliza cuando el número de iteraciones es conocido o está definido por una colección (iterable). El </w:t>
+      </w:r>
+      <w:proofErr w:type="spellStart"/>
+      <w:r>
+        <w:t>while</w:t>
+      </w:r>
+      <w:proofErr w:type="spellEnd"/>
+      <w:r>
+        <w:t xml:space="preserve"> depende de una condición </w:t>
+      </w:r>
+      <w:r>
+        <w:lastRenderedPageBreak/>
+        <w:t>de verdad y se usa cuando no se sabe de antemano cuántas veces se ejecutará el código.</w:t>
+      </w:r>
+    </w:p>
+    <w:p>
+      <w:r>
+        <w:rPr>
+          <w:b/>
+          <w:bCs/>
+        </w:rPr>
+        <w:t>2. En lógica de predicados, ¿qué estructura de Python usarías para verificar si "Existe un $x$ en el conjunto $S$ tal que $P(x)$ es verdadero"?</w:t>
+      </w:r>
+    </w:p>
+    <w:p>
+      <w:pPr>
+        <w:numPr>
+          <w:ilvl w:val="0"/>
+          <w:numId w:val="2"/>
+        </w:numPr>
+      </w:pPr>
+      <w:r>
+        <w:rPr>
+          <w:b/>
+          <w:bCs/>
+        </w:rPr>
+        <w:t>Respuesta:</w:t>
+      </w:r>
+      <w:r>
+        <w:t xml:space="preserve"> Un bucle </w:t>
+      </w:r>
+      <w:proofErr w:type="spellStart"/>
+      <w:r>
+        <w:t>for</w:t>
+      </w:r>
+      <w:proofErr w:type="spellEnd"/>
+      <w:r>
+        <w:t xml:space="preserve"> que recorra el conjunto $S$ con un condicional </w:t>
+      </w:r>
+      <w:proofErr w:type="spellStart"/>
+      <w:r>
+        <w:t>if</w:t>
+      </w:r>
+      <w:proofErr w:type="spellEnd"/>
+      <w:r>
+        <w:t xml:space="preserve"> P(x): y una sentencia break o un </w:t>
+      </w:r>
+      <w:proofErr w:type="spellStart"/>
+      <w:r>
+        <w:t>return</w:t>
+      </w:r>
+      <w:proofErr w:type="spellEnd"/>
+      <w:r>
+        <w:t xml:space="preserve"> True apenas se cumpla la condición.</w:t>
+      </w:r>
+    </w:p>
+    <w:p>
+      <w:r>
+        <w:rPr>
+          <w:b/>
+          <w:bCs/>
+        </w:rPr>
+        <w:t xml:space="preserve">3. ¿Qué sucede si una función en Python no tiene una sentencia </w:t>
+      </w:r>
+      <w:proofErr w:type="spellStart"/>
+      <w:r>
+        <w:rPr>
+          <w:b/>
+          <w:bCs/>
+        </w:rPr>
+        <w:t>return</w:t>
+      </w:r>
+      <w:proofErr w:type="spellEnd"/>
+      <w:r>
+        <w:rPr>
+          <w:b/>
+          <w:bCs/>
+        </w:rPr>
+        <w:t xml:space="preserve"> explícita?</w:t>
+      </w:r>
+    </w:p>
+    <w:p>
+      <w:pPr>
+        <w:numPr>
+          <w:ilvl w:val="0"/>
+          <w:numId w:val="3"/>
+        </w:numPr>
+      </w:pPr>
+      <w:r>
+        <w:rPr>
+          <w:b/>
+          <w:bCs/>
+        </w:rPr>
+        <w:t>Respuesta:</w:t>
+      </w:r>
+      <w:r>
+        <w:t xml:space="preserve"> La función ejecuta su bloque de código y retorna automáticamente el valor </w:t>
+      </w:r>
+      <w:proofErr w:type="spellStart"/>
+      <w:r>
+        <w:t>None</w:t>
+      </w:r>
+      <w:proofErr w:type="spellEnd"/>
+      <w:r>
+        <w:t>.</w:t>
+      </w:r>
+    </w:p>
+    <w:p>
+      <w:r>
+        <w:rPr>
+          <w:b/>
+          <w:bCs/>
+        </w:rPr>
+        <w:t>4. Explique el concepto de "Short-</w:t>
+      </w:r>
+      <w:proofErr w:type="spellStart"/>
+      <w:r>
+        <w:rPr>
+          <w:b/>
+          <w:bCs/>
+        </w:rPr>
+        <w:t>circuit</w:t>
+      </w:r>
+      <w:proofErr w:type="spellEnd"/>
+      <w:r>
+        <w:rPr>
+          <w:b/>
+          <w:bCs/>
+        </w:rPr>
+        <w:t xml:space="preserve"> </w:t>
+      </w:r>
+      <w:proofErr w:type="spellStart"/>
+      <w:r>
+        <w:rPr>
+          <w:b/>
+          <w:bCs/>
+        </w:rPr>
+        <w:t>evaluation</w:t>
+      </w:r>
+      <w:proofErr w:type="spellEnd"/>
+      <w:r>
+        <w:rPr>
+          <w:b/>
+          <w:bCs/>
+        </w:rPr>
+        <w:t xml:space="preserve">" en un condicional </w:t>
+      </w:r>
+      <w:proofErr w:type="spellStart"/>
+      <w:r>
+        <w:rPr>
+          <w:b/>
+          <w:bCs/>
+        </w:rPr>
+        <w:t>if</w:t>
+      </w:r>
+      <w:proofErr w:type="spellEnd"/>
+      <w:r>
+        <w:rPr>
+          <w:b/>
+          <w:bCs/>
+        </w:rPr>
+        <w:t xml:space="preserve"> A and </w:t>
+      </w:r>
+      <w:proofErr w:type="gramStart"/>
+      <w:r>
+        <w:rPr>
+          <w:b/>
+          <w:bCs/>
+        </w:rPr>
+        <w:t>B:.</w:t>
+      </w:r>
+      <w:proofErr w:type="gramEnd"/>
+    </w:p>
+    <w:p>
+      <w:pPr>
+        <w:numPr>
+          <w:ilvl w:val="0"/>
+          <w:numId w:val="4"/>
+        </w:numPr>
+      </w:pPr>
+      <w:r>
+        <w:rPr>
+          <w:b/>
+          <w:bCs/>
+        </w:rPr>
+        <w:t>Respuesta:</w:t>
+      </w:r>
+      <w:r>
+        <w:t xml:space="preserve"> Si A es falso, Python no evalúa B, ya que el resultado de la conjunción será falso independientemente del valor de B. Esto es crucial para evitar errores (ej. evitar división por cero).</w:t>
+      </w:r>
+    </w:p>
+    <w:p>
+      <w:r>
+        <w:rPr>
+          <w:b/>
+          <w:bCs/>
+        </w:rPr>
+        <w:t>5. ¿Qué es el "</w:t>
+      </w:r>
+      <w:proofErr w:type="spellStart"/>
+      <w:r>
+        <w:rPr>
+          <w:b/>
+          <w:bCs/>
+        </w:rPr>
+        <w:t>scope</w:t>
+      </w:r>
+      <w:proofErr w:type="spellEnd"/>
+      <w:r>
+        <w:rPr>
+          <w:b/>
+          <w:bCs/>
+        </w:rPr>
+        <w:t>" o alcance de una variable definida dentro de una función?</w:t>
+      </w:r>
+    </w:p>
+    <w:p>
+      <w:pPr>
+        <w:numPr>
+          <w:ilvl w:val="0"/>
+          <w:numId w:val="5"/>
+        </w:numPr>
+      </w:pPr>
+      <w:r>
+        <w:rPr>
+          <w:b/>
+          <w:bCs/>
+        </w:rPr>
+        <w:t>Respuesta:</w:t>
+      </w:r>
+      <w:r>
+        <w:t xml:space="preserve"> Es local. La variable solo existe y es accesible mientras la función se está ejecutando. Al terminar, la variable se destruye.</w:t>
+      </w:r>
+    </w:p>
+    <w:p>
+      <w:r>
+        <w:rPr>
+          <w:b/>
+          <w:bCs/>
+        </w:rPr>
+        <w:t>6. ¿Cómo se representa matemáticamente la composición de funciones $f(g(x</w:t>
+      </w:r>
+      <w:proofErr w:type="gramStart"/>
+      <w:r>
+        <w:rPr>
+          <w:b/>
+          <w:bCs/>
+        </w:rPr>
+        <w:t>))$</w:t>
+      </w:r>
+      <w:proofErr w:type="gramEnd"/>
+      <w:r>
+        <w:rPr>
+          <w:b/>
+          <w:bCs/>
+        </w:rPr>
+        <w:t xml:space="preserve"> en Python?</w:t>
+      </w:r>
+    </w:p>
+    <w:p>
+      <w:pPr>
+        <w:numPr>
+          <w:ilvl w:val="0"/>
+          <w:numId w:val="6"/>
+        </w:numPr>
+      </w:pPr>
+      <w:r>
+        <w:rPr>
+          <w:b/>
+          <w:bCs/>
+        </w:rPr>
+        <w:t>Respuesta:</w:t>
+      </w:r>
+      <w:r>
+        <w:t xml:space="preserve"> resultado = f(g(x)), asumiendo que ambas han sido definidas previamente con </w:t>
+      </w:r>
+      <w:proofErr w:type="spellStart"/>
+      <w:r>
+        <w:t>def</w:t>
+      </w:r>
+      <w:proofErr w:type="spellEnd"/>
+      <w:r>
+        <w:t>.</w:t>
+      </w:r>
+    </w:p>
+    <w:p>
+      <w:r>
+        <w:rPr>
+          <w:b/>
+          <w:bCs/>
+        </w:rPr>
+        <w:t xml:space="preserve">7. ¿Para qué sirve el operador </w:t>
+      </w:r>
+      <w:proofErr w:type="spellStart"/>
+      <w:r>
+        <w:rPr>
+          <w:b/>
+          <w:bCs/>
+        </w:rPr>
+        <w:t>is</w:t>
+      </w:r>
+      <w:proofErr w:type="spellEnd"/>
+      <w:r>
+        <w:rPr>
+          <w:b/>
+          <w:bCs/>
+        </w:rPr>
+        <w:t xml:space="preserve"> en comparación con ==?</w:t>
+      </w:r>
+    </w:p>
+    <w:p>
+      <w:pPr>
+        <w:numPr>
+          <w:ilvl w:val="0"/>
+          <w:numId w:val="7"/>
+        </w:numPr>
+      </w:pPr>
+      <w:r>
+        <w:rPr>
+          <w:b/>
+          <w:bCs/>
+        </w:rPr>
+        <w:t>Respuesta:</w:t>
+      </w:r>
+      <w:r>
+        <w:t xml:space="preserve"> == compara igualdad de valor (contenido), mientras que </w:t>
+      </w:r>
+      <w:proofErr w:type="spellStart"/>
+      <w:r>
+        <w:t>is</w:t>
+      </w:r>
+      <w:proofErr w:type="spellEnd"/>
+      <w:r>
+        <w:t xml:space="preserve"> compara identidad de objeto (si apuntan al mismo lugar en memoria).</w:t>
+      </w:r>
+    </w:p>
+    <w:p>
+      <w:r>
+        <w:rPr>
+          <w:b/>
+          <w:bCs/>
+        </w:rPr>
+        <w:t>8. Defina qué es una función pura en el contexto de programación funcional.</w:t>
+      </w:r>
+    </w:p>
+    <w:p>
+      <w:pPr>
+        <w:numPr>
+          <w:ilvl w:val="0"/>
+          <w:numId w:val="8"/>
+        </w:numPr>
+      </w:pPr>
+      <w:r>
+        <w:rPr>
+          <w:b/>
+          <w:bCs/>
+        </w:rPr>
+        <w:t>Respuesta:</w:t>
+      </w:r>
+      <w:r>
+        <w:t xml:space="preserve"> Es una función que, dados los mismos argumentos, siempre devuelve el mismo resultado y no tiene efectos secundarios (no modifica variables globales ni imprime en consola).</w:t>
+      </w:r>
+    </w:p>
+    <w:p>
+      <w:r>
+        <w:rPr>
+          <w:b/>
+          <w:bCs/>
+        </w:rPr>
+        <w:t xml:space="preserve">9. ¿Cuál es la complejidad lógica de un condicional anidado frente a un </w:t>
+      </w:r>
+      <w:proofErr w:type="spellStart"/>
+      <w:r>
+        <w:rPr>
+          <w:b/>
+          <w:bCs/>
+        </w:rPr>
+        <w:t>elif</w:t>
+      </w:r>
+      <w:proofErr w:type="spellEnd"/>
+      <w:r>
+        <w:rPr>
+          <w:b/>
+          <w:bCs/>
+        </w:rPr>
+        <w:t>?</w:t>
+      </w:r>
+    </w:p>
+    <w:p>
+      <w:pPr>
+        <w:numPr>
+          <w:ilvl w:val="0"/>
+          <w:numId w:val="9"/>
+        </w:numPr>
+      </w:pPr>
+      <w:r>
+        <w:rPr>
+          <w:b/>
+          <w:bCs/>
+        </w:rPr>
+        <w:lastRenderedPageBreak/>
+        <w:t>Respuesta:</w:t>
+      </w:r>
+      <w:r>
+        <w:t xml:space="preserve"> El </w:t>
+      </w:r>
+      <w:proofErr w:type="spellStart"/>
+      <w:r>
+        <w:t>elif</w:t>
+      </w:r>
+      <w:proofErr w:type="spellEnd"/>
+      <w:r>
+        <w:t xml:space="preserve"> es más eficiente y legible para evaluar condiciones mutuamente excluyentes, evitando niveles innecesarios de </w:t>
+      </w:r>
+      <w:proofErr w:type="spellStart"/>
+      <w:r>
+        <w:t>indentación</w:t>
+      </w:r>
+      <w:proofErr w:type="spellEnd"/>
+      <w:r>
+        <w:t>.</w:t>
+      </w:r>
+    </w:p>
+    <w:p>
+      <w:r>
+        <w:rPr>
+          <w:b/>
+          <w:bCs/>
+        </w:rPr>
+        <w:t xml:space="preserve">10. ¿Qué hace la función </w:t>
+      </w:r>
+      <w:proofErr w:type="spellStart"/>
+      <w:proofErr w:type="gramStart"/>
+      <w:r>
+        <w:rPr>
+          <w:b/>
+          <w:bCs/>
+        </w:rPr>
+        <w:t>enumerate</w:t>
+      </w:r>
+      <w:proofErr w:type="spellEnd"/>
+      <w:r>
+        <w:rPr>
+          <w:b/>
+          <w:bCs/>
+        </w:rPr>
+        <w:t>(</w:t>
+      </w:r>
+      <w:proofErr w:type="gramEnd"/>
+      <w:r>
+        <w:rPr>
+          <w:b/>
+          <w:bCs/>
+        </w:rPr>
+        <w:t>) al iterar sobre una lista?</w:t>
+      </w:r>
+    </w:p>
+    <w:p>
+      <w:pPr>
+        <w:numPr>
+          <w:ilvl w:val="0"/>
+          <w:numId w:val="10"/>
+        </w:numPr>
+      </w:pPr>
+      <w:r>
+        <w:rPr>
+          <w:b/>
+          <w:bCs/>
+        </w:rPr>
+        <w:t>Respuesta:</w:t>
+      </w:r>
+      <w:r>
+        <w:t xml:space="preserve"> Devuelve pares ordenados (tuplas) que contienen el índice y el valor del elemento actual: $(i, </w:t>
+      </w:r>
+      <w:proofErr w:type="spellStart"/>
+      <w:r>
+        <w:t>x_</w:t>
+      </w:r>
+      <w:proofErr w:type="gramStart"/>
+      <w:r>
+        <w:t>i</w:t>
+      </w:r>
+      <w:proofErr w:type="spellEnd"/>
+      <w:r>
+        <w:t>)$</w:t>
+      </w:r>
+      <w:proofErr w:type="gramEnd"/>
+      <w:r>
+        <w:t>.</w:t>
+      </w:r>
+    </w:p>
+    <w:p/>
+    <w:p/>
+    <w:p>
+      <w:pPr>
+        <w:rPr>
+          <w:b/>
+          <w:bCs/>
+        </w:rPr>
+      </w:pPr>
+      <w:r>
+        <w:rPr>
+          <w:b/>
+          <w:bCs/>
+        </w:rPr>
+        <w:t>Sección II: Componente Práctico (Implementación en Jupyter)</w:t>
+      </w:r>
+    </w:p>
+    <w:p>
+      <w:r>
+        <w:rPr>
+          <w:i/>
+          <w:iCs/>
+        </w:rPr>
+        <w:t>Esta sección debe resolverse en una celda de código. Se busca aplicar conceptos de geometría y cálculo.</w:t>
+      </w:r>
+    </w:p>
+    <w:p>
+      <w:r>
+        <w:rPr>
+          <w:b/>
+          <w:bCs/>
+        </w:rPr>
+        <w:t xml:space="preserve">11. Escriba una función </w:t>
+      </w:r>
+      <w:proofErr w:type="spellStart"/>
+      <w:r>
+        <w:rPr>
+          <w:b/>
+          <w:bCs/>
+        </w:rPr>
+        <w:t>es_</w:t>
+      </w:r>
+      <w:proofErr w:type="gramStart"/>
+      <w:r>
+        <w:rPr>
+          <w:b/>
+          <w:bCs/>
+        </w:rPr>
+        <w:t>ortogonal</w:t>
+      </w:r>
+      <w:proofErr w:type="spellEnd"/>
+      <w:r>
+        <w:rPr>
+          <w:b/>
+          <w:bCs/>
+        </w:rPr>
+        <w:t>(</w:t>
+      </w:r>
+      <w:proofErr w:type="gramEnd"/>
+      <w:r>
+        <w:rPr>
+          <w:b/>
+          <w:bCs/>
+        </w:rPr>
+        <w:t>u, v) que reciba dos listas (vectores de $\</w:t>
+      </w:r>
+      <w:proofErr w:type="spellStart"/>
+      <w:r>
+        <w:rPr>
+          <w:b/>
+          <w:bCs/>
+        </w:rPr>
+        <w:t>mathbb</w:t>
+      </w:r>
+      <w:proofErr w:type="spellEnd"/>
+      <w:r>
+        <w:rPr>
+          <w:b/>
+          <w:bCs/>
+        </w:rPr>
+        <w:t>{R}^n$) y devuelva True si su producto escalar es 0.</w:t>
+      </w:r>
+    </w:p>
+    <w:p>
+      <w:r>
+        <w:t>Python</w:t>
+      </w:r>
+    </w:p>
+    <w:p>
+      <w:proofErr w:type="spellStart"/>
+      <w:r>
+        <w:t>def</w:t>
+      </w:r>
+      <w:proofErr w:type="spellEnd"/>
+      <w:r>
+        <w:t xml:space="preserve"> </w:t>
+      </w:r>
+      <w:proofErr w:type="spellStart"/>
+      <w:r>
+        <w:t>es_</w:t>
+      </w:r>
+      <w:proofErr w:type="gramStart"/>
+      <w:r>
+        <w:t>ortogonal</w:t>
+      </w:r>
+      <w:proofErr w:type="spellEnd"/>
+      <w:r>
+        <w:t>(</w:t>
+      </w:r>
+      <w:proofErr w:type="gramEnd"/>
+      <w:r>
+        <w:t>u, v):</w:t>
+      </w:r>
+    </w:p>
+    <w:p>
+      <w:pPr>
+        <w:rPr>
+          <w:lang w:val="en-US"/>
+        </w:rPr>
+      </w:pPr>
+      <w:r>
+        <w:t xml:space="preserve">    </w:t>
+      </w:r>
+      <w:proofErr w:type="spellStart"/>
+      <w:r>
+        <w:rPr>
+          <w:lang w:val="en-US"/>
+        </w:rPr>
+        <w:t>dot_product</w:t>
+      </w:r>
+      <w:proofErr w:type="spellEnd"/>
+      <w:r>
+        <w:rPr>
+          <w:lang w:val="en-US"/>
+        </w:rPr>
+        <w:t xml:space="preserve"> = sum(u[</w:t>
+      </w:r>
+      <w:proofErr w:type="spellStart"/>
+      <w:r>
+        <w:rPr>
+          <w:lang w:val="en-US"/>
+        </w:rPr>
+        <w:t>i</w:t>
+      </w:r>
+      <w:proofErr w:type="spellEnd"/>
+      <w:r>
+        <w:rPr>
+          <w:lang w:val="en-US"/>
+        </w:rPr>
+        <w:t>] * v[</w:t>
+      </w:r>
+      <w:proofErr w:type="spellStart"/>
+      <w:r>
+        <w:rPr>
+          <w:lang w:val="en-US"/>
+        </w:rPr>
+        <w:t>i</w:t>
+      </w:r>
+      <w:proofErr w:type="spellEnd"/>
+      <w:r>
+        <w:rPr>
+          <w:lang w:val="en-US"/>
+        </w:rPr>
+        <w:t xml:space="preserve">] for </w:t>
+      </w:r>
+      <w:proofErr w:type="spellStart"/>
+      <w:r>
+        <w:rPr>
+          <w:lang w:val="en-US"/>
+        </w:rPr>
+        <w:t>i</w:t>
+      </w:r>
+      <w:proofErr w:type="spellEnd"/>
+      <w:r>
+        <w:rPr>
+          <w:lang w:val="en-US"/>
+        </w:rPr>
+        <w:t xml:space="preserve"> in range(</w:t>
+      </w:r>
+      <w:proofErr w:type="spellStart"/>
+      <w:r>
+        <w:rPr>
+          <w:lang w:val="en-US"/>
+        </w:rPr>
+        <w:t>len</w:t>
+      </w:r>
+      <w:proofErr w:type="spellEnd"/>
+      <w:r>
+        <w:rPr>
+          <w:lang w:val="en-US"/>
+        </w:rPr>
+        <w:t>(u)))</w:t>
+      </w:r>
+    </w:p>
+    <w:p>
+      <w:r>
+        <w:rPr>
+          <w:lang w:val="en-US"/>
+        </w:rPr>
+        <w:t xml:space="preserve">    </w:t>
+      </w:r>
+      <w:proofErr w:type="spellStart"/>
+      <w:r>
+        <w:t>return</w:t>
+      </w:r>
+      <w:proofErr w:type="spellEnd"/>
+      <w:r>
+        <w:t xml:space="preserve"> </w:t>
+      </w:r>
+      <w:proofErr w:type="spellStart"/>
+      <w:r>
+        <w:t>dot_product</w:t>
+      </w:r>
+      <w:proofErr w:type="spellEnd"/>
+      <w:r>
+        <w:t xml:space="preserve"> == 0</w:t>
+      </w:r>
+    </w:p>
+    <w:p>
+      <w:r>
+        <w:rPr>
+          <w:b/>
+          <w:bCs/>
+        </w:rPr>
+        <w:t>12. Implemente un bucle que calcule la aproximación de la serie $\sum_{n=</w:t>
+      </w:r>
+      <w:proofErr w:type="gramStart"/>
+      <w:r>
+        <w:rPr>
+          <w:b/>
+          <w:bCs/>
+        </w:rPr>
+        <w:t>1}^</w:t>
+      </w:r>
+      <w:proofErr w:type="gramEnd"/>
+      <w:r>
+        <w:rPr>
+          <w:b/>
+          <w:bCs/>
+        </w:rPr>
+        <w:t>{100} \frac{</w:t>
+      </w:r>
+      <w:proofErr w:type="gramStart"/>
+      <w:r>
+        <w:rPr>
+          <w:b/>
+          <w:bCs/>
+        </w:rPr>
+        <w:t>1}{</w:t>
+      </w:r>
+      <w:proofErr w:type="gramEnd"/>
+      <w:r>
+        <w:rPr>
+          <w:b/>
+          <w:bCs/>
+        </w:rPr>
+        <w:t>n^</w:t>
+      </w:r>
+      <w:proofErr w:type="gramStart"/>
+      <w:r>
+        <w:rPr>
+          <w:b/>
+          <w:bCs/>
+        </w:rPr>
+        <w:t>2}$</w:t>
+      </w:r>
+      <w:proofErr w:type="gramEnd"/>
+      <w:r>
+        <w:rPr>
+          <w:b/>
+          <w:bCs/>
+        </w:rPr>
+        <w:t>.</w:t>
+      </w:r>
+    </w:p>
+    <w:p>
+      <w:pPr>
+        <w:rPr>
+          <w:lang w:val="en-US"/>
+        </w:rPr>
+      </w:pPr>
+      <w:r>
+        <w:rPr>
+          <w:lang w:val="en-US"/>
+        </w:rPr>
+        <w:t>Python</w:t>
+      </w:r>
+    </w:p>
+    <w:p>
+      <w:pPr>
+        <w:rPr>
+          <w:lang w:val="en-US"/>
+        </w:rPr>
+      </w:pPr>
+      <w:proofErr w:type="spellStart"/>
+      <w:r>
+        <w:rPr>
+          <w:lang w:val="en-US"/>
+        </w:rPr>
+        <w:t>suma</w:t>
+      </w:r>
+      <w:proofErr w:type="spellEnd"/>
+      <w:r>
+        <w:rPr>
+          <w:lang w:val="en-US"/>
+        </w:rPr>
+        <w:t xml:space="preserve"> = 0</w:t>
+      </w:r>
+    </w:p>
+    <w:p>
+      <w:pPr>
+        <w:rPr>
+          <w:lang w:val="en-US"/>
+        </w:rPr>
+      </w:pPr>
+      <w:r>
+        <w:rPr>
+          <w:lang w:val="en-US"/>
+        </w:rPr>
+        <w:t xml:space="preserve">for n in </w:t>
+      </w:r>
+      <w:proofErr w:type="gramStart"/>
+      <w:r>
+        <w:rPr>
+          <w:lang w:val="en-US"/>
+        </w:rPr>
+        <w:t>range(</w:t>
+      </w:r>
+      <w:proofErr w:type="gramEnd"/>
+      <w:r>
+        <w:rPr>
+          <w:lang w:val="en-US"/>
+        </w:rPr>
+        <w:t>1, 101):</w:t>
+      </w:r>
+    </w:p>
+    <w:p>
+      <w:r>
+        <w:rPr>
+          <w:lang w:val="en-US"/>
+        </w:rPr>
+        <w:t xml:space="preserve">    </w:t>
+      </w:r>
+      <w:r>
+        <w:t>suma += 1 / (n**2)</w:t>
+      </w:r>
+    </w:p>
+    <w:p>
+      <w:proofErr w:type="spellStart"/>
+      <w:r>
+        <w:t>print</w:t>
+      </w:r>
+      <w:proofErr w:type="spellEnd"/>
+      <w:r>
+        <w:t>(suma)</w:t>
+      </w:r>
+    </w:p>
+    <w:p>
+      <w:r>
+        <w:rPr>
+          <w:b/>
+          <w:bCs/>
+        </w:rPr>
+        <w:t xml:space="preserve">13. Cree una función que reciba los coeficientes $(a, b, </w:t>
+      </w:r>
+      <w:proofErr w:type="gramStart"/>
+      <w:r>
+        <w:rPr>
+          <w:b/>
+          <w:bCs/>
+        </w:rPr>
+        <w:t>c)$</w:t>
+      </w:r>
+      <w:proofErr w:type="gramEnd"/>
+      <w:r>
+        <w:rPr>
+          <w:b/>
+          <w:bCs/>
+        </w:rPr>
+        <w:t xml:space="preserve"> de una ecuación cuadrática y retorne las raíces reales usando condicionales para validar el discriminante $\Delta$.</w:t>
+      </w:r>
+    </w:p>
+    <w:p>
+      <w:r>
+        <w:t>Python</w:t>
+      </w:r>
+    </w:p>
+    <w:p>
+      <w:proofErr w:type="spellStart"/>
+      <w:r>
+        <w:t>def</w:t>
+      </w:r>
+      <w:proofErr w:type="spellEnd"/>
+      <w:r>
+        <w:t xml:space="preserve"> </w:t>
+      </w:r>
+      <w:proofErr w:type="spellStart"/>
+      <w:r>
+        <w:t>resolver_</w:t>
+      </w:r>
+      <w:proofErr w:type="gramStart"/>
+      <w:r>
+        <w:t>cuadratica</w:t>
+      </w:r>
+      <w:proofErr w:type="spellEnd"/>
+      <w:r>
+        <w:t>(</w:t>
+      </w:r>
+      <w:proofErr w:type="gramEnd"/>
+      <w:r>
+        <w:t>a, b, c):</w:t>
+      </w:r>
+    </w:p>
+    <w:p>
+      <w:pPr>
+        <w:rPr>
+          <w:lang w:val="en-US"/>
+        </w:rPr>
+      </w:pPr>
+      <w:r>
+        <w:lastRenderedPageBreak/>
+        <w:t xml:space="preserve">    </w:t>
+      </w:r>
+      <w:r>
+        <w:rPr>
+          <w:lang w:val="en-US"/>
+        </w:rPr>
+        <w:t>disc = b**2 - 4*a*c</w:t>
+      </w:r>
+    </w:p>
+    <w:p>
+      <w:pPr>
+        <w:rPr>
+          <w:lang w:val="en-US"/>
+        </w:rPr>
+      </w:pPr>
+      <w:r>
+        <w:rPr>
+          <w:lang w:val="en-US"/>
+        </w:rPr>
+        <w:t xml:space="preserve">    if disc &lt; 0:</w:t>
+      </w:r>
+    </w:p>
+    <w:p>
+      <w:pPr>
+        <w:rPr>
+          <w:lang w:val="en-US"/>
+        </w:rPr>
+      </w:pPr>
+      <w:r>
+        <w:rPr>
+          <w:lang w:val="en-US"/>
+        </w:rPr>
+        <w:t xml:space="preserve">        return "</w:t>
+      </w:r>
+      <w:proofErr w:type="spellStart"/>
+      <w:r>
+        <w:rPr>
+          <w:lang w:val="en-US"/>
+        </w:rPr>
+        <w:t>Raíces</w:t>
+      </w:r>
+      <w:proofErr w:type="spellEnd"/>
+      <w:r>
+        <w:rPr>
+          <w:lang w:val="en-US"/>
+        </w:rPr>
+        <w:t xml:space="preserve"> </w:t>
+      </w:r>
+      <w:proofErr w:type="spellStart"/>
+      <w:r>
+        <w:rPr>
+          <w:lang w:val="en-US"/>
+        </w:rPr>
+        <w:t>complejas</w:t>
+      </w:r>
+      <w:proofErr w:type="spellEnd"/>
+      <w:r>
+        <w:rPr>
+          <w:lang w:val="en-US"/>
+        </w:rPr>
+        <w:t>"</w:t>
+      </w:r>
+    </w:p>
+    <w:p>
+      <w:pPr>
+        <w:rPr>
+          <w:lang w:val="en-US"/>
+        </w:rPr>
+      </w:pPr>
+      <w:r>
+        <w:rPr>
+          <w:lang w:val="en-US"/>
+        </w:rPr>
+        <w:t xml:space="preserve">    x1 = (-b + </w:t>
+      </w:r>
+      <w:proofErr w:type="gramStart"/>
+      <w:r>
+        <w:rPr>
+          <w:lang w:val="en-US"/>
+        </w:rPr>
+        <w:t>disc**</w:t>
+      </w:r>
+      <w:proofErr w:type="gramEnd"/>
+      <w:r>
+        <w:rPr>
+          <w:lang w:val="en-US"/>
+        </w:rPr>
+        <w:t>0.5) / (2*a)</w:t>
+      </w:r>
+    </w:p>
+    <w:p>
+      <w:pPr>
+        <w:rPr>
+          <w:lang w:val="en-US"/>
+        </w:rPr>
+      </w:pPr>
+      <w:r>
+        <w:rPr>
+          <w:lang w:val="en-US"/>
+        </w:rPr>
+        <w:t xml:space="preserve">    x2 = (-b - disc**0.5) / (2*a)</w:t>
+      </w:r>
+    </w:p>
+    <w:p>
+      <w:pPr>
+        <w:rPr>
+          <w:lang w:val="en-US"/>
+        </w:rPr>
+      </w:pPr>
+      <w:r>
+        <w:rPr>
+          <w:lang w:val="en-US"/>
+        </w:rPr>
+        <w:t xml:space="preserve">    return x1, x2</w:t>
+      </w:r>
+    </w:p>
+    <w:p>
+      <w:pPr>
+        <w:rPr>
+          <w:lang w:val="en-US"/>
+        </w:rPr>
+      </w:pPr>
+      <w:r>
+        <w:rPr>
+          <w:b/>
+          <w:bCs/>
+        </w:rPr>
+        <w:t xml:space="preserve">14. Use un bucle </w:t>
+      </w:r>
+      <w:proofErr w:type="spellStart"/>
+      <w:r>
+        <w:rPr>
+          <w:b/>
+          <w:bCs/>
+        </w:rPr>
+        <w:t>while</w:t>
+      </w:r>
+      <w:proofErr w:type="spellEnd"/>
+      <w:r>
+        <w:rPr>
+          <w:b/>
+          <w:bCs/>
+        </w:rPr>
+        <w:t xml:space="preserve"> para encontrar el menor entero $n$ tal que $n! </w:t>
+      </w:r>
+      <w:r>
+        <w:rPr>
+          <w:b/>
+          <w:bCs/>
+          <w:lang w:val="en-US"/>
+        </w:rPr>
+        <w:t>&gt; 10</w:t>
+      </w:r>
+      <w:proofErr w:type="gramStart"/>
+      <w:r>
+        <w:rPr>
+          <w:b/>
+          <w:bCs/>
+          <w:lang w:val="en-US"/>
+        </w:rPr>
+        <w:t>^{10}$</w:t>
+      </w:r>
+      <w:proofErr w:type="gramEnd"/>
+      <w:r>
+        <w:rPr>
+          <w:b/>
+          <w:bCs/>
+          <w:lang w:val="en-US"/>
+        </w:rPr>
+        <w:t>.</w:t>
+      </w:r>
+    </w:p>
+    <w:p>
+      <w:pPr>
+        <w:rPr>
+          <w:lang w:val="en-US"/>
+        </w:rPr>
+      </w:pPr>
+      <w:r>
+        <w:rPr>
+          <w:lang w:val="en-US"/>
+        </w:rPr>
+        <w:t>Python</w:t>
+      </w:r>
+    </w:p>
+    <w:p>
+      <w:pPr>
+        <w:rPr>
+          <w:lang w:val="en-US"/>
+        </w:rPr>
+      </w:pPr>
+      <w:r>
+        <w:rPr>
+          <w:lang w:val="en-US"/>
+        </w:rPr>
+        <w:t>import math</w:t>
+      </w:r>
+    </w:p>
+    <w:p>
+      <w:pPr>
+        <w:rPr>
+          <w:lang w:val="en-US"/>
+        </w:rPr>
+      </w:pPr>
+      <w:r>
+        <w:rPr>
+          <w:lang w:val="en-US"/>
+        </w:rPr>
+        <w:t>n = 1</w:t>
+      </w:r>
+    </w:p>
+    <w:p>
+      <w:pPr>
+        <w:rPr>
+          <w:lang w:val="en-US"/>
+        </w:rPr>
+      </w:pPr>
+      <w:r>
+        <w:rPr>
+          <w:lang w:val="en-US"/>
+        </w:rPr>
+        <w:t xml:space="preserve">while </w:t>
+      </w:r>
+      <w:proofErr w:type="spellStart"/>
+      <w:proofErr w:type="gramStart"/>
+      <w:r>
+        <w:rPr>
+          <w:lang w:val="en-US"/>
+        </w:rPr>
+        <w:t>math.factorial</w:t>
+      </w:r>
+      <w:proofErr w:type="spellEnd"/>
+      <w:proofErr w:type="gramEnd"/>
+      <w:r>
+        <w:rPr>
+          <w:lang w:val="en-US"/>
+        </w:rPr>
+        <w:t>(n) &lt;= 10**10:</w:t>
+      </w:r>
+    </w:p>
+    <w:p>
+      <w:pPr>
+        <w:rPr>
+          <w:lang w:val="en-US"/>
+        </w:rPr>
+      </w:pPr>
+      <w:r>
+        <w:rPr>
+          <w:lang w:val="en-US"/>
+        </w:rPr>
+        <w:t xml:space="preserve">    n += 1</w:t>
+      </w:r>
+    </w:p>
+    <w:p>
+      <w:pPr>
+        <w:rPr>
+          <w:lang w:val="en-US"/>
+        </w:rPr>
+      </w:pPr>
+      <w:r>
+        <w:rPr>
+          <w:lang w:val="en-US"/>
+        </w:rPr>
+        <w:t>print(n)</w:t>
+      </w:r>
+    </w:p>
+    <w:p>
+      <w:r>
+        <w:rPr>
+          <w:b/>
+          <w:bCs/>
+        </w:rPr>
+        <w:t>15. Escriba una función que reciba una lista de números y devuelva una nueva lista solo con los números primos (</w:t>
+      </w:r>
+      <w:proofErr w:type="gramStart"/>
+      <w:r>
+        <w:rPr>
+          <w:b/>
+          <w:bCs/>
+        </w:rPr>
+        <w:t>aplique lógica</w:t>
+      </w:r>
+      <w:proofErr w:type="gramEnd"/>
+      <w:r>
+        <w:rPr>
+          <w:b/>
+          <w:bCs/>
+        </w:rPr>
+        <w:t xml:space="preserve"> de predicados).</w:t>
+      </w:r>
+    </w:p>
+    <w:p>
+      <w:r>
+        <w:t>Python</w:t>
+      </w:r>
+    </w:p>
+    <w:p>
+      <w:proofErr w:type="spellStart"/>
+      <w:r>
+        <w:t>def</w:t>
+      </w:r>
+      <w:proofErr w:type="spellEnd"/>
+      <w:r>
+        <w:t xml:space="preserve"> </w:t>
+      </w:r>
+      <w:proofErr w:type="spellStart"/>
+      <w:r>
+        <w:t>es_primo</w:t>
+      </w:r>
+      <w:proofErr w:type="spellEnd"/>
+      <w:r>
+        <w:t>(</w:t>
+      </w:r>
+      <w:proofErr w:type="spellStart"/>
+      <w:r>
+        <w:t>num</w:t>
+      </w:r>
+      <w:proofErr w:type="spellEnd"/>
+      <w:r>
+        <w:t>):</w:t>
+      </w:r>
+    </w:p>
+    <w:p>
+      <w:pPr>
+        <w:rPr>
+          <w:lang w:val="en-US"/>
+        </w:rPr>
+      </w:pPr>
+      <w:r>
+        <w:t xml:space="preserve">    </w:t>
+      </w:r>
+      <w:r>
+        <w:rPr>
+          <w:lang w:val="en-US"/>
+        </w:rPr>
+        <w:t>if num &lt; 2: return False</w:t>
+      </w:r>
+    </w:p>
+    <w:p>
+      <w:pPr>
+        <w:rPr>
+          <w:lang w:val="en-US"/>
+        </w:rPr>
+      </w:pPr>
+      <w:r>
+        <w:rPr>
+          <w:lang w:val="en-US"/>
+        </w:rPr>
+        <w:t xml:space="preserve">    for </w:t>
+      </w:r>
+      <w:proofErr w:type="spellStart"/>
+      <w:r>
+        <w:rPr>
+          <w:lang w:val="en-US"/>
+        </w:rPr>
+        <w:t>i</w:t>
+      </w:r>
+      <w:proofErr w:type="spellEnd"/>
+      <w:r>
+        <w:rPr>
+          <w:lang w:val="en-US"/>
+        </w:rPr>
+        <w:t xml:space="preserve"> in </w:t>
+      </w:r>
+      <w:proofErr w:type="gramStart"/>
+      <w:r>
+        <w:rPr>
+          <w:lang w:val="en-US"/>
+        </w:rPr>
+        <w:t>range(</w:t>
+      </w:r>
+      <w:proofErr w:type="gramEnd"/>
+      <w:r>
+        <w:rPr>
+          <w:lang w:val="en-US"/>
+        </w:rPr>
+        <w:t>2, int(num**0.5) + 1):</w:t>
+      </w:r>
+    </w:p>
+    <w:p>
+      <w:pPr>
+        <w:rPr>
+          <w:lang w:val="en-US"/>
+        </w:rPr>
+      </w:pPr>
+      <w:r>
+        <w:rPr>
+          <w:lang w:val="en-US"/>
+        </w:rPr>
+        <w:t xml:space="preserve">        if num % </w:t>
+      </w:r>
+      <w:proofErr w:type="spellStart"/>
+      <w:r>
+        <w:rPr>
+          <w:lang w:val="en-US"/>
+        </w:rPr>
+        <w:t>i</w:t>
+      </w:r>
+      <w:proofErr w:type="spellEnd"/>
+      <w:r>
+        <w:rPr>
+          <w:lang w:val="en-US"/>
+        </w:rPr>
+        <w:t xml:space="preserve"> == 0: return False</w:t>
+      </w:r>
+    </w:p>
+    <w:p>
+      <w:pPr>
+        <w:rPr>
+          <w:lang w:val="en-US"/>
+        </w:rPr>
+      </w:pPr>
+      <w:r>
+        <w:rPr>
+          <w:lang w:val="en-US"/>
+        </w:rPr>
+        <w:t xml:space="preserve">    </w:t>
+      </w:r>
+      <w:proofErr w:type="gramStart"/>
+      <w:r>
+        <w:rPr>
+          <w:lang w:val="en-US"/>
+        </w:rPr>
+        <w:t>return</w:t>
+      </w:r>
+      <w:proofErr w:type="gramEnd"/>
+      <w:r>
+        <w:rPr>
+          <w:lang w:val="en-US"/>
+        </w:rPr>
+        <w:t xml:space="preserve"> True</w:t>
+      </w:r>
+    </w:p>
+    <w:p>
+      <w:pPr>
+        <w:rPr>
+          <w:lang w:val="en-US"/>
+        </w:rPr>
+      </w:pPr>
+    </w:p>
+    <w:p>
+      <w:proofErr w:type="spellStart"/>
+      <w:r>
+        <w:t>def</w:t>
+      </w:r>
+      <w:proofErr w:type="spellEnd"/>
+      <w:r>
+        <w:t xml:space="preserve"> </w:t>
+      </w:r>
+      <w:proofErr w:type="spellStart"/>
+      <w:r>
+        <w:t>filtrar_primos</w:t>
+      </w:r>
+      <w:proofErr w:type="spellEnd"/>
+      <w:r>
+        <w:t>(lista):</w:t>
+      </w:r>
+    </w:p>
+    <w:p>
+      <w:r>
+        <w:t xml:space="preserve">    </w:t>
+      </w:r>
+      <w:proofErr w:type="spellStart"/>
+      <w:r>
+        <w:t>return</w:t>
+      </w:r>
+      <w:proofErr w:type="spellEnd"/>
+      <w:r>
+        <w:t xml:space="preserve"> [x </w:t>
+      </w:r>
+      <w:proofErr w:type="spellStart"/>
+      <w:r>
+        <w:t>for</w:t>
+      </w:r>
+      <w:proofErr w:type="spellEnd"/>
+      <w:r>
+        <w:t xml:space="preserve"> x in lista </w:t>
+      </w:r>
+      <w:proofErr w:type="spellStart"/>
+      <w:r>
+        <w:t>if</w:t>
+      </w:r>
+      <w:proofErr w:type="spellEnd"/>
+      <w:r>
+        <w:t xml:space="preserve"> </w:t>
+      </w:r>
+      <w:proofErr w:type="spellStart"/>
+      <w:r>
+        <w:t>es_primo</w:t>
+      </w:r>
+      <w:proofErr w:type="spellEnd"/>
+      <w:r>
+        <w:t>(x)]</w:t>
+      </w:r>
+    </w:p>
+    <w:p>
+      <w:r>
+        <w:rPr>
+          <w:b/>
+          <w:bCs/>
+        </w:rPr>
+        <w:t>16. Diseñe una función que calcule la norma euclidiana $\|v\|$ de un vector de dimensión arbitraria.</w:t>
+      </w:r>
+    </w:p>
+    <w:p>
+      <w:r>
+        <w:t>Python</w:t>
+      </w:r>
+    </w:p>
+    <w:p>
+      <w:proofErr w:type="spellStart"/>
+      <w:r>
+        <w:lastRenderedPageBreak/>
+        <w:t>def</w:t>
+      </w:r>
+      <w:proofErr w:type="spellEnd"/>
+      <w:r>
+        <w:t xml:space="preserve"> </w:t>
+      </w:r>
+      <w:proofErr w:type="spellStart"/>
+      <w:r>
+        <w:t>norma_euclidiana</w:t>
+      </w:r>
+      <w:proofErr w:type="spellEnd"/>
+      <w:r>
+        <w:t>(v):</w:t>
+      </w:r>
+    </w:p>
+    <w:p>
+      <w:pPr>
+        <w:rPr>
+          <w:lang w:val="en-US"/>
+        </w:rPr>
+      </w:pPr>
+      <w:r>
+        <w:t xml:space="preserve">    </w:t>
+      </w:r>
+      <w:r>
+        <w:rPr>
+          <w:lang w:val="en-US"/>
+        </w:rPr>
+        <w:t xml:space="preserve">return </w:t>
+      </w:r>
+      <w:proofErr w:type="gramStart"/>
+      <w:r>
+        <w:rPr>
+          <w:lang w:val="en-US"/>
+        </w:rPr>
+        <w:t>sum(</w:t>
+      </w:r>
+      <w:proofErr w:type="gramEnd"/>
+      <w:r>
+        <w:rPr>
+          <w:lang w:val="en-US"/>
+        </w:rPr>
+        <w:t xml:space="preserve">x**2 for x in </w:t>
+      </w:r>
+      <w:proofErr w:type="gramStart"/>
+      <w:r>
+        <w:rPr>
+          <w:lang w:val="en-US"/>
+        </w:rPr>
+        <w:t>v)*</w:t>
+      </w:r>
+      <w:proofErr w:type="gramEnd"/>
+      <w:r>
+        <w:rPr>
+          <w:lang w:val="en-US"/>
+        </w:rPr>
+        <w:t>*0.5</w:t>
+      </w:r>
+    </w:p>
+    <w:p>
+      <w:r>
+        <w:rPr>
+          <w:b/>
+          <w:bCs/>
+        </w:rPr>
+        <w:t>17. Implemente una función que reciba una función $f$ y un punto $x$, y devuelva una aproximación de la derivada $f'(x)$ usando la definición de límite con $h = 10</w:t>
+      </w:r>
+      <w:proofErr w:type="gramStart"/>
+      <w:r>
+        <w:rPr>
+          <w:b/>
+          <w:bCs/>
+        </w:rPr>
+        <w:t>^{</w:t>
+      </w:r>
+      <w:proofErr w:type="gramEnd"/>
+      <w:r>
+        <w:rPr>
+          <w:b/>
+          <w:bCs/>
+        </w:rPr>
+        <w:t>-</w:t>
+      </w:r>
+      <w:proofErr w:type="gramStart"/>
+      <w:r>
+        <w:rPr>
+          <w:b/>
+          <w:bCs/>
+        </w:rPr>
+        <w:t>7}$</w:t>
+      </w:r>
+      <w:proofErr w:type="gramEnd"/>
+      <w:r>
+        <w:rPr>
+          <w:b/>
+          <w:bCs/>
+        </w:rPr>
+        <w:t>.</w:t>
+      </w:r>
+    </w:p>
+    <w:p>
+      <w:r>
+        <w:t>Python</w:t>
+      </w:r>
+    </w:p>
+    <w:p>
+      <w:proofErr w:type="spellStart"/>
+      <w:r>
+        <w:t>def</w:t>
+      </w:r>
+      <w:proofErr w:type="spellEnd"/>
+      <w:r>
+        <w:t xml:space="preserve"> </w:t>
+      </w:r>
+      <w:proofErr w:type="gramStart"/>
+      <w:r>
+        <w:t>derivada(</w:t>
+      </w:r>
+      <w:proofErr w:type="gramEnd"/>
+      <w:r>
+        <w:t>f, x, h=1e-7):</w:t>
+      </w:r>
+    </w:p>
+    <w:p>
+      <w:pPr>
+        <w:rPr>
+          <w:lang w:val="en-US"/>
+        </w:rPr>
+      </w:pPr>
+      <w:r>
+        <w:t xml:space="preserve">    </w:t>
+      </w:r>
+      <w:r>
+        <w:rPr>
+          <w:lang w:val="en-US"/>
+        </w:rPr>
+        <w:t>return (</w:t>
+      </w:r>
+      <w:proofErr w:type="gramStart"/>
+      <w:r>
+        <w:rPr>
+          <w:lang w:val="en-US"/>
+        </w:rPr>
+        <w:t>f(</w:t>
+      </w:r>
+      <w:proofErr w:type="gramEnd"/>
+      <w:r>
+        <w:rPr>
+          <w:lang w:val="en-US"/>
+        </w:rPr>
+        <w:t>x + h) - f(x)) / h</w:t>
+      </w:r>
+    </w:p>
+    <w:p>
+      <w:r>
+        <w:rPr>
+          <w:b/>
+          <w:bCs/>
+        </w:rPr>
+        <w:t>18. Cree un bucle que genere los primeros 20 términos de la sucesión de Fibonacci.</w:t>
+      </w:r>
+    </w:p>
+    <w:p>
+      <w:pPr>
+        <w:rPr>
+          <w:lang w:val="en-US"/>
+        </w:rPr>
+      </w:pPr>
+      <w:r>
+        <w:rPr>
+          <w:lang w:val="en-US"/>
+        </w:rPr>
+        <w:t>Python</w:t>
+      </w:r>
+    </w:p>
+    <w:p>
+      <w:pPr>
+        <w:rPr>
+          <w:lang w:val="en-US"/>
+        </w:rPr>
+      </w:pPr>
+      <w:r>
+        <w:rPr>
+          <w:lang w:val="en-US"/>
+        </w:rPr>
+        <w:t>fib = [0, 1]</w:t>
+      </w:r>
+    </w:p>
+    <w:p>
+      <w:pPr>
+        <w:rPr>
+          <w:lang w:val="en-US"/>
+        </w:rPr>
+      </w:pPr>
+      <w:r>
+        <w:rPr>
+          <w:lang w:val="en-US"/>
+        </w:rPr>
+        <w:t xml:space="preserve">for </w:t>
+      </w:r>
+      <w:proofErr w:type="spellStart"/>
+      <w:r>
+        <w:rPr>
+          <w:lang w:val="en-US"/>
+        </w:rPr>
+        <w:t>i</w:t>
+      </w:r>
+      <w:proofErr w:type="spellEnd"/>
+      <w:r>
+        <w:rPr>
+          <w:lang w:val="en-US"/>
+        </w:rPr>
+        <w:t xml:space="preserve"> in </w:t>
+      </w:r>
+      <w:proofErr w:type="gramStart"/>
+      <w:r>
+        <w:rPr>
+          <w:lang w:val="en-US"/>
+        </w:rPr>
+        <w:t>range(</w:t>
+      </w:r>
+      <w:proofErr w:type="gramEnd"/>
+      <w:r>
+        <w:rPr>
+          <w:lang w:val="en-US"/>
+        </w:rPr>
+        <w:t>2, 20):</w:t>
+      </w:r>
+    </w:p>
+    <w:p>
+      <w:pPr>
+        <w:rPr>
+          <w:lang w:val="en-US"/>
+        </w:rPr>
+      </w:pPr>
+      <w:r>
+        <w:rPr>
+          <w:lang w:val="en-US"/>
+        </w:rPr>
+        <w:t xml:space="preserve">    </w:t>
+      </w:r>
+      <w:proofErr w:type="spellStart"/>
+      <w:proofErr w:type="gramStart"/>
+      <w:r>
+        <w:rPr>
+          <w:lang w:val="en-US"/>
+        </w:rPr>
+        <w:t>fib.append</w:t>
+      </w:r>
+      <w:proofErr w:type="spellEnd"/>
+      <w:proofErr w:type="gramEnd"/>
+      <w:r>
+        <w:rPr>
+          <w:lang w:val="en-US"/>
+        </w:rPr>
+        <w:t>(</w:t>
+      </w:r>
+      <w:proofErr w:type="gramStart"/>
+      <w:r>
+        <w:rPr>
+          <w:lang w:val="en-US"/>
+        </w:rPr>
+        <w:t>fib[</w:t>
+      </w:r>
+      <w:proofErr w:type="gramEnd"/>
+      <w:r>
+        <w:rPr>
+          <w:lang w:val="en-US"/>
+        </w:rPr>
+        <w:t xml:space="preserve">-1] + </w:t>
+      </w:r>
+      <w:proofErr w:type="gramStart"/>
+      <w:r>
+        <w:rPr>
+          <w:lang w:val="en-US"/>
+        </w:rPr>
+        <w:t>fib[</w:t>
+      </w:r>
+      <w:proofErr w:type="gramEnd"/>
+      <w:r>
+        <w:rPr>
+          <w:lang w:val="en-US"/>
+        </w:rPr>
+        <w:t>-2])</w:t>
+      </w:r>
+    </w:p>
+    <w:p>
+      <w:pPr>
+        <w:rPr>
+          <w:lang w:val="en-US"/>
+        </w:rPr>
+      </w:pPr>
+      <w:r>
+        <w:rPr>
+          <w:lang w:val="en-US"/>
+        </w:rPr>
+        <w:t>print(fib)</w:t>
+      </w:r>
+    </w:p>
+    <w:p>
+      <w:r>
+        <w:rPr>
+          <w:b/>
+          <w:bCs/>
+        </w:rPr>
+        <w:t>19. Escriba una función que verifique si una matriz (lista de listas) es cuadrada.</w:t>
+      </w:r>
+    </w:p>
+    <w:p>
+      <w:r>
+        <w:t>Python</w:t>
+      </w:r>
+    </w:p>
+    <w:p>
+      <w:proofErr w:type="spellStart"/>
+      <w:r>
+        <w:t>def</w:t>
+      </w:r>
+      <w:proofErr w:type="spellEnd"/>
+      <w:r>
+        <w:t xml:space="preserve"> </w:t>
+      </w:r>
+      <w:proofErr w:type="spellStart"/>
+      <w:r>
+        <w:t>es_cuadrada</w:t>
+      </w:r>
+      <w:proofErr w:type="spellEnd"/>
+      <w:r>
+        <w:t>(matriz):</w:t>
+      </w:r>
+    </w:p>
+    <w:p>
+      <w:pPr>
+        <w:rPr>
+          <w:lang w:val="en-US"/>
+        </w:rPr>
+      </w:pPr>
+      <w:r>
+        <w:t xml:space="preserve">    </w:t>
+      </w:r>
+      <w:proofErr w:type="spellStart"/>
+      <w:r>
+        <w:rPr>
+          <w:lang w:val="en-US"/>
+        </w:rPr>
+        <w:t>filas</w:t>
+      </w:r>
+      <w:proofErr w:type="spellEnd"/>
+      <w:r>
+        <w:rPr>
+          <w:lang w:val="en-US"/>
+        </w:rPr>
+        <w:t xml:space="preserve"> = </w:t>
+      </w:r>
+      <w:proofErr w:type="spellStart"/>
+      <w:r>
+        <w:rPr>
+          <w:lang w:val="en-US"/>
+        </w:rPr>
+        <w:t>len</w:t>
+      </w:r>
+      <w:proofErr w:type="spellEnd"/>
+      <w:r>
+        <w:rPr>
+          <w:lang w:val="en-US"/>
+        </w:rPr>
+        <w:t>(</w:t>
+      </w:r>
+      <w:proofErr w:type="spellStart"/>
+      <w:r>
+        <w:rPr>
+          <w:lang w:val="en-US"/>
+        </w:rPr>
+        <w:t>matriz</w:t>
+      </w:r>
+      <w:proofErr w:type="spellEnd"/>
+      <w:r>
+        <w:rPr>
+          <w:lang w:val="en-US"/>
+        </w:rPr>
+        <w:t>)</w:t>
+      </w:r>
+    </w:p>
+    <w:p>
+      <w:pPr>
+        <w:rPr>
+          <w:lang w:val="en-US"/>
+        </w:rPr>
+      </w:pPr>
+      <w:r>
+        <w:rPr>
+          <w:lang w:val="en-US"/>
+        </w:rPr>
+        <w:t xml:space="preserve">    for fila in </w:t>
+      </w:r>
+      <w:proofErr w:type="spellStart"/>
+      <w:r>
+        <w:rPr>
+          <w:lang w:val="en-US"/>
+        </w:rPr>
+        <w:t>matriz</w:t>
+      </w:r>
+      <w:proofErr w:type="spellEnd"/>
+      <w:r>
+        <w:rPr>
+          <w:lang w:val="en-US"/>
+        </w:rPr>
+        <w:t>:</w:t>
+      </w:r>
+    </w:p>
+    <w:p>
+      <w:pPr>
+        <w:rPr>
+          <w:lang w:val="en-US"/>
+        </w:rPr>
+      </w:pPr>
+      <w:r>
+        <w:rPr>
+          <w:lang w:val="en-US"/>
+        </w:rPr>
+        <w:t xml:space="preserve">        if </w:t>
+      </w:r>
+      <w:proofErr w:type="spellStart"/>
+      <w:r>
+        <w:rPr>
+          <w:lang w:val="en-US"/>
+        </w:rPr>
+        <w:t>len</w:t>
+      </w:r>
+      <w:proofErr w:type="spellEnd"/>
+      <w:r>
+        <w:rPr>
+          <w:lang w:val="en-US"/>
+        </w:rPr>
+        <w:t>(fila</w:t>
+      </w:r>
+      <w:proofErr w:type="gramStart"/>
+      <w:r>
+        <w:rPr>
+          <w:lang w:val="en-US"/>
+        </w:rPr>
+        <w:t>) !</w:t>
+      </w:r>
+      <w:proofErr w:type="gramEnd"/>
+      <w:r>
+        <w:rPr>
+          <w:lang w:val="en-US"/>
+        </w:rPr>
+        <w:t xml:space="preserve">= </w:t>
+      </w:r>
+      <w:proofErr w:type="spellStart"/>
+      <w:r>
+        <w:rPr>
+          <w:lang w:val="en-US"/>
+        </w:rPr>
+        <w:t>filas</w:t>
+      </w:r>
+      <w:proofErr w:type="spellEnd"/>
+      <w:r>
+        <w:rPr>
+          <w:lang w:val="en-US"/>
+        </w:rPr>
+        <w:t>:</w:t>
+      </w:r>
+    </w:p>
+    <w:p>
+      <w:pPr>
+        <w:rPr>
+          <w:lang w:val="en-US"/>
+        </w:rPr>
+      </w:pPr>
+      <w:r>
+        <w:rPr>
+          <w:lang w:val="en-US"/>
+        </w:rPr>
+        <w:t xml:space="preserve">            </w:t>
+      </w:r>
+      <w:proofErr w:type="gramStart"/>
+      <w:r>
+        <w:rPr>
+          <w:lang w:val="en-US"/>
+        </w:rPr>
+        <w:t>return</w:t>
+      </w:r>
+      <w:proofErr w:type="gramEnd"/>
+      <w:r>
+        <w:rPr>
+          <w:lang w:val="en-US"/>
+        </w:rPr>
+        <w:t xml:space="preserve"> False</w:t>
+      </w:r>
+    </w:p>
+    <w:p>
+      <w:r>
+        <w:rPr>
+          <w:lang w:val="en-US"/>
+        </w:rPr>
+        <w:t xml:space="preserve">    </w:t>
+      </w:r>
+      <w:proofErr w:type="spellStart"/>
+      <w:r>
+        <w:t>return</w:t>
+      </w:r>
+      <w:proofErr w:type="spellEnd"/>
+      <w:r>
+        <w:t xml:space="preserve"> True</w:t>
+      </w:r>
+    </w:p>
+    <w:p>
+      <w:r>
+        <w:rPr>
+          <w:b/>
+          <w:bCs/>
+        </w:rPr>
+        <w:t xml:space="preserve">20. Desarrolle un programa que reciba un conjunto de puntos $(x, </w:t>
+      </w:r>
+      <w:proofErr w:type="gramStart"/>
+      <w:r>
+        <w:rPr>
+          <w:b/>
+          <w:bCs/>
+        </w:rPr>
+        <w:t>y)$</w:t>
+      </w:r>
+      <w:proofErr w:type="gramEnd"/>
+      <w:r>
+        <w:rPr>
+          <w:b/>
+          <w:bCs/>
+        </w:rPr>
+        <w:t xml:space="preserve"> y determine en qué cuadrante se encuentra cada uno usando </w:t>
+      </w:r>
+      <w:proofErr w:type="spellStart"/>
+      <w:r>
+        <w:rPr>
+          <w:b/>
+          <w:bCs/>
+        </w:rPr>
+        <w:t>if-elif-else</w:t>
+      </w:r>
+      <w:proofErr w:type="spellEnd"/>
+      <w:r>
+        <w:rPr>
+          <w:b/>
+          <w:bCs/>
+        </w:rPr>
+        <w:t>.</w:t>
+      </w:r>
+    </w:p>
+    <w:p>
+      <w:r>
+        <w:t>Python</w:t>
+      </w:r>
+    </w:p>
+    <w:p>
+      <w:proofErr w:type="spellStart"/>
+      <w:r>
+        <w:t>def</w:t>
+      </w:r>
+      <w:proofErr w:type="spellEnd"/>
+      <w:r>
+        <w:t xml:space="preserve"> </w:t>
+      </w:r>
+      <w:proofErr w:type="spellStart"/>
+      <w:r>
+        <w:t>determinar_cuadrante</w:t>
+      </w:r>
+      <w:proofErr w:type="spellEnd"/>
+      <w:r>
+        <w:t>(puntos):</w:t>
+      </w:r>
+    </w:p>
+    <w:p>
+      <w:pPr>
+        <w:rPr>
+          <w:lang w:val="en-US"/>
+        </w:rPr>
+      </w:pPr>
+      <w:r>
+        <w:lastRenderedPageBreak/>
+        <w:t xml:space="preserve">    </w:t>
+      </w:r>
+      <w:r>
+        <w:rPr>
+          <w:lang w:val="en-US"/>
+        </w:rPr>
+        <w:t>for x, y in puntos:</w:t>
+      </w:r>
+    </w:p>
+    <w:p>
+      <w:pPr>
+        <w:rPr>
+          <w:lang w:val="en-US"/>
+        </w:rPr>
+      </w:pPr>
+      <w:r>
+        <w:rPr>
+          <w:lang w:val="en-US"/>
+        </w:rPr>
+        <w:t xml:space="preserve">        if x &gt; 0 and y &gt; 0: print(f</w:t>
+      </w:r>
+      <w:proofErr w:type="gramStart"/>
+      <w:r>
+        <w:rPr>
+          <w:lang w:val="en-US"/>
+        </w:rPr>
+        <w:t>"({</w:t>
+      </w:r>
+      <w:proofErr w:type="gramEnd"/>
+      <w:r>
+        <w:rPr>
+          <w:lang w:val="en-US"/>
+        </w:rPr>
+        <w:t>x</w:t>
+      </w:r>
+      <w:proofErr w:type="gramStart"/>
+      <w:r>
+        <w:rPr>
+          <w:lang w:val="en-US"/>
+        </w:rPr>
+        <w:t>},{y})</w:t>
+      </w:r>
+      <w:proofErr w:type="gramEnd"/>
+      <w:r>
+        <w:rPr>
+          <w:lang w:val="en-US"/>
+        </w:rPr>
+        <w:t xml:space="preserve"> </w:t>
+      </w:r>
+      <w:proofErr w:type="spellStart"/>
+      <w:r>
+        <w:rPr>
+          <w:lang w:val="en-US"/>
+        </w:rPr>
+        <w:t>Cuadrante</w:t>
+      </w:r>
+      <w:proofErr w:type="spellEnd"/>
+      <w:r>
+        <w:rPr>
+          <w:lang w:val="en-US"/>
+        </w:rPr>
+        <w:t xml:space="preserve"> I")</w:t>
+      </w:r>
+    </w:p>
+    <w:p>
+      <w:pPr>
+        <w:rPr>
+          <w:lang w:val="en-US"/>
+        </w:rPr>
+      </w:pPr>
+      <w:r>
+        <w:rPr>
+          <w:lang w:val="en-US"/>
+        </w:rPr>
+        <w:t xml:space="preserve">        </w:t>
+      </w:r>
+      <w:proofErr w:type="spellStart"/>
+      <w:r>
+        <w:rPr>
+          <w:lang w:val="en-US"/>
+        </w:rPr>
+        <w:t>elif</w:t>
+      </w:r>
+      <w:proofErr w:type="spellEnd"/>
+      <w:r>
+        <w:rPr>
+          <w:lang w:val="en-US"/>
+        </w:rPr>
+        <w:t xml:space="preserve"> x &lt; 0 and y &gt; 0: print(f</w:t>
+      </w:r>
+      <w:proofErr w:type="gramStart"/>
+      <w:r>
+        <w:rPr>
+          <w:lang w:val="en-US"/>
+        </w:rPr>
+        <w:t>"({</w:t>
+      </w:r>
+      <w:proofErr w:type="gramEnd"/>
+      <w:r>
+        <w:rPr>
+          <w:lang w:val="en-US"/>
+        </w:rPr>
+        <w:t>x</w:t>
+      </w:r>
+      <w:proofErr w:type="gramStart"/>
+      <w:r>
+        <w:rPr>
+          <w:lang w:val="en-US"/>
+        </w:rPr>
+        <w:t>},{y})</w:t>
+      </w:r>
+      <w:proofErr w:type="gramEnd"/>
+      <w:r>
+        <w:rPr>
+          <w:lang w:val="en-US"/>
+        </w:rPr>
+        <w:t xml:space="preserve"> </w:t>
+      </w:r>
+      <w:proofErr w:type="spellStart"/>
+      <w:r>
+        <w:rPr>
+          <w:lang w:val="en-US"/>
+        </w:rPr>
+        <w:t>Cuadrante</w:t>
+      </w:r>
+      <w:proofErr w:type="spellEnd"/>
+      <w:r>
+        <w:rPr>
+          <w:lang w:val="en-US"/>
+        </w:rPr>
+        <w:t xml:space="preserve"> II")</w:t>
+      </w:r>
+    </w:p>
+    <w:p>
+      <w:pPr>
+        <w:rPr>
+          <w:lang w:val="en-US"/>
+        </w:rPr>
+      </w:pPr>
+      <w:r>
+        <w:rPr>
+          <w:lang w:val="en-US"/>
+        </w:rPr>
+        <w:t xml:space="preserve">        </w:t>
+      </w:r>
+      <w:proofErr w:type="spellStart"/>
+      <w:r>
+        <w:rPr>
+          <w:lang w:val="en-US"/>
+        </w:rPr>
+        <w:t>elif</w:t>
+      </w:r>
+      <w:proofErr w:type="spellEnd"/>
+      <w:r>
+        <w:rPr>
+          <w:lang w:val="en-US"/>
+        </w:rPr>
+        <w:t xml:space="preserve"> x &lt; 0 and y &lt; 0: print(f</w:t>
+      </w:r>
+      <w:proofErr w:type="gramStart"/>
+      <w:r>
+        <w:rPr>
+          <w:lang w:val="en-US"/>
+        </w:rPr>
+        <w:t>"({</w:t>
+      </w:r>
+      <w:proofErr w:type="gramEnd"/>
+      <w:r>
+        <w:rPr>
+          <w:lang w:val="en-US"/>
+        </w:rPr>
+        <w:t>x</w:t>
+      </w:r>
+      <w:proofErr w:type="gramStart"/>
+      <w:r>
+        <w:rPr>
+          <w:lang w:val="en-US"/>
+        </w:rPr>
+        <w:t>},{y})</w:t>
+      </w:r>
+      <w:proofErr w:type="gramEnd"/>
+      <w:r>
+        <w:rPr>
+          <w:lang w:val="en-US"/>
+        </w:rPr>
+        <w:t xml:space="preserve"> </w:t>
+      </w:r>
+      <w:proofErr w:type="spellStart"/>
+      <w:r>
+        <w:rPr>
+          <w:lang w:val="en-US"/>
+        </w:rPr>
+        <w:t>Cuadrante</w:t>
+      </w:r>
+      <w:proofErr w:type="spellEnd"/>
+      <w:r>
+        <w:rPr>
+          <w:lang w:val="en-US"/>
+        </w:rPr>
+        <w:t xml:space="preserve"> III")</w:t>
+      </w:r>
+    </w:p>
+    <w:p>
+      <w:r>
+        <w:rPr>
+          <w:lang w:val="en-US"/>
+        </w:rPr>
+        <w:t xml:space="preserve">        </w:t>
+      </w:r>
+      <w:proofErr w:type="spellStart"/>
+      <w:r>
+        <w:t>elif</w:t>
+      </w:r>
+      <w:proofErr w:type="spellEnd"/>
+      <w:r>
+        <w:t xml:space="preserve"> x &gt; 0 and y &lt; 0: </w:t>
+      </w:r>
+      <w:proofErr w:type="spellStart"/>
+      <w:r>
+        <w:t>print</w:t>
+      </w:r>
+      <w:proofErr w:type="spellEnd"/>
+      <w:r>
+        <w:t>(f"({x</w:t>
+      </w:r>
+      <w:proofErr w:type="gramStart"/>
+      <w:r>
+        <w:t>},{</w:t>
+      </w:r>
+      <w:proofErr w:type="gramEnd"/>
+      <w:r>
+        <w:t>y}) Cuadrante IV")</w:t>
+      </w:r>
+    </w:p>
+    <w:p>
+      <w:r>
+        <w:t xml:space="preserve">        </w:t>
+      </w:r>
+      <w:proofErr w:type="spellStart"/>
+      <w:r>
+        <w:t>else</w:t>
+      </w:r>
+      <w:proofErr w:type="spellEnd"/>
+      <w:r>
+        <w:t xml:space="preserve">: </w:t>
+      </w:r>
+      <w:proofErr w:type="spellStart"/>
+      <w:r>
+        <w:t>print</w:t>
+      </w:r>
+      <w:proofErr w:type="spellEnd"/>
+      <w:r>
+        <w:t>(f"({x</w:t>
+      </w:r>
+      <w:proofErr w:type="gramStart"/>
+      <w:r>
+        <w:t>},{</w:t>
+      </w:r>
+      <w:proofErr w:type="gramEnd"/>
+      <w:r>
+        <w:t>y}) Sobre un eje u origen")</w:t>
+      </w:r>
+    </w:p>
+    <w:p/>
+    <w:p/>
     <w:p>
       <w:pPr>
         <w:rPr>
@@ -228,6 +2662,1531 @@
     </w:sectPr>
   </w:body>
 </w:document>
+</file>
+
+<file path=word/numbering.xml><?xml version="1.0" encoding="utf-8"?>
+<w:numbering xmlns:wpc="http://schemas.microsoft.com/office/word/2010/wordprocessingCanvas" xmlns:cx="http://schemas.microsoft.com/office/drawing/2014/chartex" xmlns:cx1="http://schemas.microsoft.com/office/drawing/2015/9/8/chartex" xmlns:cx2="http://schemas.microsoft.com/office/drawing/2015/10/21/chartex" xmlns:cx3="http://schemas.microsoft.com/office/drawing/2016/5/9/chartex" xmlns:cx4="http://schemas.microsoft.com/office/drawing/2016/5/10/chartex" xmlns:cx5="http://schemas.microsoft.com/office/drawing/2016/5/11/chartex" xmlns:cx6="http://schemas.microsoft.com/office/drawing/2016/5/12/chartex" xmlns:cx7="http://schemas.microsoft.com/office/drawing/2016/5/13/chartex" xmlns:cx8="http://schemas.microsoft.com/office/drawing/2016/5/14/chartex" xmlns:mc="http://schemas.openxmlformats.org/markup-compatibility/2006" xmlns:aink="http://schemas.microsoft.com/office/drawing/2016/ink" xmlns:am3d="http://schemas.microsoft.com/office/drawing/2017/model3d" xmlns:o="urn:schemas-microsoft-com:office:office" xmlns:oel="http://schemas.microsoft.com/office/2019/extlst" xmlns:r="http://schemas.openxmlformats.org/officeDocument/2006/relationships" xmlns:m="http://schemas.openxmlformats.org/officeDocument/2006/math" xmlns:v="urn:schemas-microsoft-com:vml" xmlns:wp14="http://schemas.microsoft.com/office/word/2010/wordprocessingDrawing" xmlns:wp="http://schemas.openxmlformats.org/drawingml/2006/wordprocessingDrawing" xmlns:w10="urn:schemas-microsoft-com:office:word" xmlns:w="http://schemas.openxmlformats.org/wordprocessingml/2006/main" xmlns:w14="http://schemas.microsoft.com/office/word/2010/wordml" xmlns:w15="http://schemas.microsoft.com/office/word/2012/wordml" xmlns:w16cex="http://schemas.microsoft.com/office/word/2018/wordml/cex" xmlns:w16cid="http://schemas.microsoft.com/office/word/2016/wordml/cid" xmlns:w16="http://schemas.microsoft.com/office/word/2018/wordml" xmlns:w16du="http://schemas.microsoft.com/office/word/2023/wordml/word16du" xmlns:w16sdtdh="http://schemas.microsoft.com/office/word/2020/wordml/sdtdatahash" xmlns:w16sdtfl="http://schemas.microsoft.com/office/word/2024/wordml/sdtformatlock" xmlns:w16se="http://schemas.microsoft.com/office/word/2015/wordml/symex" xmlns:wpg="http://schemas.microsoft.com/office/word/2010/wordprocessingGroup" xmlns:wpi="http://schemas.microsoft.com/office/word/2010/wordprocessingInk" xmlns:wne="http://schemas.microsoft.com/office/word/2006/wordml" xmlns:wps="http://schemas.microsoft.com/office/word/2010/wordprocessingShape" mc:Ignorable="w14 w15 w16se w16cid w16 w16cex w16sdtdh w16sdtfl w16du wp14">
+  <w:abstractNum w:abstractNumId="0" w15:restartNumberingAfterBreak="0">
+    <w:nsid w:val="090402C4"/>
+    <w:multiLevelType w:val="multilevel"/>
+    <w:tmpl w:val="6E5E86FE"/>
+    <w:lvl w:ilvl="0">
+      <w:start w:val="1"/>
+      <w:numFmt w:val="bullet"/>
+      <w:lvlText w:val=""/>
+      <w:lvlJc w:val="left"/>
+      <w:pPr>
+        <w:tabs>
+          <w:tab w:val="num" w:pos="720"/>
+        </w:tabs>
+        <w:ind w:left="720" w:hanging="360"/>
+      </w:pPr>
+      <w:rPr>
+        <w:rFonts w:ascii="Symbol" w:hAnsi="Symbol" w:hint="default"/>
+        <w:sz w:val="20"/>
+      </w:rPr>
+    </w:lvl>
+    <w:lvl w:ilvl="1" w:tentative="1">
+      <w:start w:val="1"/>
+      <w:numFmt w:val="bullet"/>
+      <w:lvlText w:val="o"/>
+      <w:lvlJc w:val="left"/>
+      <w:pPr>
+        <w:tabs>
+          <w:tab w:val="num" w:pos="1440"/>
+        </w:tabs>
+        <w:ind w:left="1440" w:hanging="360"/>
+      </w:pPr>
+      <w:rPr>
+        <w:rFonts w:ascii="Courier New" w:hAnsi="Courier New" w:hint="default"/>
+        <w:sz w:val="20"/>
+      </w:rPr>
+    </w:lvl>
+    <w:lvl w:ilvl="2" w:tentative="1">
+      <w:start w:val="1"/>
+      <w:numFmt w:val="bullet"/>
+      <w:lvlText w:val=""/>
+      <w:lvlJc w:val="left"/>
+      <w:pPr>
+        <w:tabs>
+          <w:tab w:val="num" w:pos="2160"/>
+        </w:tabs>
+        <w:ind w:left="2160" w:hanging="360"/>
+      </w:pPr>
+      <w:rPr>
+        <w:rFonts w:ascii="Wingdings" w:hAnsi="Wingdings" w:hint="default"/>
+        <w:sz w:val="20"/>
+      </w:rPr>
+    </w:lvl>
+    <w:lvl w:ilvl="3" w:tentative="1">
+      <w:start w:val="1"/>
+      <w:numFmt w:val="bullet"/>
+      <w:lvlText w:val=""/>
+      <w:lvlJc w:val="left"/>
+      <w:pPr>
+        <w:tabs>
+          <w:tab w:val="num" w:pos="2880"/>
+        </w:tabs>
+        <w:ind w:left="2880" w:hanging="360"/>
+      </w:pPr>
+      <w:rPr>
+        <w:rFonts w:ascii="Wingdings" w:hAnsi="Wingdings" w:hint="default"/>
+        <w:sz w:val="20"/>
+      </w:rPr>
+    </w:lvl>
+    <w:lvl w:ilvl="4" w:tentative="1">
+      <w:start w:val="1"/>
+      <w:numFmt w:val="bullet"/>
+      <w:lvlText w:val=""/>
+      <w:lvlJc w:val="left"/>
+      <w:pPr>
+        <w:tabs>
+          <w:tab w:val="num" w:pos="3600"/>
+        </w:tabs>
+        <w:ind w:left="3600" w:hanging="360"/>
+      </w:pPr>
+      <w:rPr>
+        <w:rFonts w:ascii="Wingdings" w:hAnsi="Wingdings" w:hint="default"/>
+        <w:sz w:val="20"/>
+      </w:rPr>
+    </w:lvl>
+    <w:lvl w:ilvl="5" w:tentative="1">
+      <w:start w:val="1"/>
+      <w:numFmt w:val="bullet"/>
+      <w:lvlText w:val=""/>
+      <w:lvlJc w:val="left"/>
+      <w:pPr>
+        <w:tabs>
+          <w:tab w:val="num" w:pos="4320"/>
+        </w:tabs>
+        <w:ind w:left="4320" w:hanging="360"/>
+      </w:pPr>
+      <w:rPr>
+        <w:rFonts w:ascii="Wingdings" w:hAnsi="Wingdings" w:hint="default"/>
+        <w:sz w:val="20"/>
+      </w:rPr>
+    </w:lvl>
+    <w:lvl w:ilvl="6" w:tentative="1">
+      <w:start w:val="1"/>
+      <w:numFmt w:val="bullet"/>
+      <w:lvlText w:val=""/>
+      <w:lvlJc w:val="left"/>
+      <w:pPr>
+        <w:tabs>
+          <w:tab w:val="num" w:pos="5040"/>
+        </w:tabs>
+        <w:ind w:left="5040" w:hanging="360"/>
+      </w:pPr>
+      <w:rPr>
+        <w:rFonts w:ascii="Wingdings" w:hAnsi="Wingdings" w:hint="default"/>
+        <w:sz w:val="20"/>
+      </w:rPr>
+    </w:lvl>
+    <w:lvl w:ilvl="7" w:tentative="1">
+      <w:start w:val="1"/>
+      <w:numFmt w:val="bullet"/>
+      <w:lvlText w:val=""/>
+      <w:lvlJc w:val="left"/>
+      <w:pPr>
+        <w:tabs>
+          <w:tab w:val="num" w:pos="5760"/>
+        </w:tabs>
+        <w:ind w:left="5760" w:hanging="360"/>
+      </w:pPr>
+      <w:rPr>
+        <w:rFonts w:ascii="Wingdings" w:hAnsi="Wingdings" w:hint="default"/>
+        <w:sz w:val="20"/>
+      </w:rPr>
+    </w:lvl>
+    <w:lvl w:ilvl="8" w:tentative="1">
+      <w:start w:val="1"/>
+      <w:numFmt w:val="bullet"/>
+      <w:lvlText w:val=""/>
+      <w:lvlJc w:val="left"/>
+      <w:pPr>
+        <w:tabs>
+          <w:tab w:val="num" w:pos="6480"/>
+        </w:tabs>
+        <w:ind w:left="6480" w:hanging="360"/>
+      </w:pPr>
+      <w:rPr>
+        <w:rFonts w:ascii="Wingdings" w:hAnsi="Wingdings" w:hint="default"/>
+        <w:sz w:val="20"/>
+      </w:rPr>
+    </w:lvl>
+  </w:abstractNum>
+  <w:abstractNum w:abstractNumId="1" w15:restartNumberingAfterBreak="0">
+    <w:nsid w:val="1C867869"/>
+    <w:multiLevelType w:val="multilevel"/>
+    <w:tmpl w:val="7318C688"/>
+    <w:lvl w:ilvl="0">
+      <w:start w:val="1"/>
+      <w:numFmt w:val="bullet"/>
+      <w:lvlText w:val=""/>
+      <w:lvlJc w:val="left"/>
+      <w:pPr>
+        <w:tabs>
+          <w:tab w:val="num" w:pos="720"/>
+        </w:tabs>
+        <w:ind w:left="720" w:hanging="360"/>
+      </w:pPr>
+      <w:rPr>
+        <w:rFonts w:ascii="Symbol" w:hAnsi="Symbol" w:hint="default"/>
+        <w:sz w:val="20"/>
+      </w:rPr>
+    </w:lvl>
+    <w:lvl w:ilvl="1" w:tentative="1">
+      <w:start w:val="1"/>
+      <w:numFmt w:val="bullet"/>
+      <w:lvlText w:val="o"/>
+      <w:lvlJc w:val="left"/>
+      <w:pPr>
+        <w:tabs>
+          <w:tab w:val="num" w:pos="1440"/>
+        </w:tabs>
+        <w:ind w:left="1440" w:hanging="360"/>
+      </w:pPr>
+      <w:rPr>
+        <w:rFonts w:ascii="Courier New" w:hAnsi="Courier New" w:hint="default"/>
+        <w:sz w:val="20"/>
+      </w:rPr>
+    </w:lvl>
+    <w:lvl w:ilvl="2" w:tentative="1">
+      <w:start w:val="1"/>
+      <w:numFmt w:val="bullet"/>
+      <w:lvlText w:val=""/>
+      <w:lvlJc w:val="left"/>
+      <w:pPr>
+        <w:tabs>
+          <w:tab w:val="num" w:pos="2160"/>
+        </w:tabs>
+        <w:ind w:left="2160" w:hanging="360"/>
+      </w:pPr>
+      <w:rPr>
+        <w:rFonts w:ascii="Wingdings" w:hAnsi="Wingdings" w:hint="default"/>
+        <w:sz w:val="20"/>
+      </w:rPr>
+    </w:lvl>
+    <w:lvl w:ilvl="3" w:tentative="1">
+      <w:start w:val="1"/>
+      <w:numFmt w:val="bullet"/>
+      <w:lvlText w:val=""/>
+      <w:lvlJc w:val="left"/>
+      <w:pPr>
+        <w:tabs>
+          <w:tab w:val="num" w:pos="2880"/>
+        </w:tabs>
+        <w:ind w:left="2880" w:hanging="360"/>
+      </w:pPr>
+      <w:rPr>
+        <w:rFonts w:ascii="Wingdings" w:hAnsi="Wingdings" w:hint="default"/>
+        <w:sz w:val="20"/>
+      </w:rPr>
+    </w:lvl>
+    <w:lvl w:ilvl="4" w:tentative="1">
+      <w:start w:val="1"/>
+      <w:numFmt w:val="bullet"/>
+      <w:lvlText w:val=""/>
+      <w:lvlJc w:val="left"/>
+      <w:pPr>
+        <w:tabs>
+          <w:tab w:val="num" w:pos="3600"/>
+        </w:tabs>
+        <w:ind w:left="3600" w:hanging="360"/>
+      </w:pPr>
+      <w:rPr>
+        <w:rFonts w:ascii="Wingdings" w:hAnsi="Wingdings" w:hint="default"/>
+        <w:sz w:val="20"/>
+      </w:rPr>
+    </w:lvl>
+    <w:lvl w:ilvl="5" w:tentative="1">
+      <w:start w:val="1"/>
+      <w:numFmt w:val="bullet"/>
+      <w:lvlText w:val=""/>
+      <w:lvlJc w:val="left"/>
+      <w:pPr>
+        <w:tabs>
+          <w:tab w:val="num" w:pos="4320"/>
+        </w:tabs>
+        <w:ind w:left="4320" w:hanging="360"/>
+      </w:pPr>
+      <w:rPr>
+        <w:rFonts w:ascii="Wingdings" w:hAnsi="Wingdings" w:hint="default"/>
+        <w:sz w:val="20"/>
+      </w:rPr>
+    </w:lvl>
+    <w:lvl w:ilvl="6" w:tentative="1">
+      <w:start w:val="1"/>
+      <w:numFmt w:val="bullet"/>
+      <w:lvlText w:val=""/>
+      <w:lvlJc w:val="left"/>
+      <w:pPr>
+        <w:tabs>
+          <w:tab w:val="num" w:pos="5040"/>
+        </w:tabs>
+        <w:ind w:left="5040" w:hanging="360"/>
+      </w:pPr>
+      <w:rPr>
+        <w:rFonts w:ascii="Wingdings" w:hAnsi="Wingdings" w:hint="default"/>
+        <w:sz w:val="20"/>
+      </w:rPr>
+    </w:lvl>
+    <w:lvl w:ilvl="7" w:tentative="1">
+      <w:start w:val="1"/>
+      <w:numFmt w:val="bullet"/>
+      <w:lvlText w:val=""/>
+      <w:lvlJc w:val="left"/>
+      <w:pPr>
+        <w:tabs>
+          <w:tab w:val="num" w:pos="5760"/>
+        </w:tabs>
+        <w:ind w:left="5760" w:hanging="360"/>
+      </w:pPr>
+      <w:rPr>
+        <w:rFonts w:ascii="Wingdings" w:hAnsi="Wingdings" w:hint="default"/>
+        <w:sz w:val="20"/>
+      </w:rPr>
+    </w:lvl>
+    <w:lvl w:ilvl="8" w:tentative="1">
+      <w:start w:val="1"/>
+      <w:numFmt w:val="bullet"/>
+      <w:lvlText w:val=""/>
+      <w:lvlJc w:val="left"/>
+      <w:pPr>
+        <w:tabs>
+          <w:tab w:val="num" w:pos="6480"/>
+        </w:tabs>
+        <w:ind w:left="6480" w:hanging="360"/>
+      </w:pPr>
+      <w:rPr>
+        <w:rFonts w:ascii="Wingdings" w:hAnsi="Wingdings" w:hint="default"/>
+        <w:sz w:val="20"/>
+      </w:rPr>
+    </w:lvl>
+  </w:abstractNum>
+  <w:abstractNum w:abstractNumId="2" w15:restartNumberingAfterBreak="0">
+    <w:nsid w:val="2F7F5BB0"/>
+    <w:multiLevelType w:val="multilevel"/>
+    <w:tmpl w:val="979E1C34"/>
+    <w:lvl w:ilvl="0">
+      <w:start w:val="1"/>
+      <w:numFmt w:val="bullet"/>
+      <w:lvlText w:val=""/>
+      <w:lvlJc w:val="left"/>
+      <w:pPr>
+        <w:tabs>
+          <w:tab w:val="num" w:pos="720"/>
+        </w:tabs>
+        <w:ind w:left="720" w:hanging="360"/>
+      </w:pPr>
+      <w:rPr>
+        <w:rFonts w:ascii="Symbol" w:hAnsi="Symbol" w:hint="default"/>
+        <w:sz w:val="20"/>
+      </w:rPr>
+    </w:lvl>
+    <w:lvl w:ilvl="1" w:tentative="1">
+      <w:start w:val="1"/>
+      <w:numFmt w:val="bullet"/>
+      <w:lvlText w:val="o"/>
+      <w:lvlJc w:val="left"/>
+      <w:pPr>
+        <w:tabs>
+          <w:tab w:val="num" w:pos="1440"/>
+        </w:tabs>
+        <w:ind w:left="1440" w:hanging="360"/>
+      </w:pPr>
+      <w:rPr>
+        <w:rFonts w:ascii="Courier New" w:hAnsi="Courier New" w:hint="default"/>
+        <w:sz w:val="20"/>
+      </w:rPr>
+    </w:lvl>
+    <w:lvl w:ilvl="2" w:tentative="1">
+      <w:start w:val="1"/>
+      <w:numFmt w:val="bullet"/>
+      <w:lvlText w:val=""/>
+      <w:lvlJc w:val="left"/>
+      <w:pPr>
+        <w:tabs>
+          <w:tab w:val="num" w:pos="2160"/>
+        </w:tabs>
+        <w:ind w:left="2160" w:hanging="360"/>
+      </w:pPr>
+      <w:rPr>
+        <w:rFonts w:ascii="Wingdings" w:hAnsi="Wingdings" w:hint="default"/>
+        <w:sz w:val="20"/>
+      </w:rPr>
+    </w:lvl>
+    <w:lvl w:ilvl="3" w:tentative="1">
+      <w:start w:val="1"/>
+      <w:numFmt w:val="bullet"/>
+      <w:lvlText w:val=""/>
+      <w:lvlJc w:val="left"/>
+      <w:pPr>
+        <w:tabs>
+          <w:tab w:val="num" w:pos="2880"/>
+        </w:tabs>
+        <w:ind w:left="2880" w:hanging="360"/>
+      </w:pPr>
+      <w:rPr>
+        <w:rFonts w:ascii="Wingdings" w:hAnsi="Wingdings" w:hint="default"/>
+        <w:sz w:val="20"/>
+      </w:rPr>
+    </w:lvl>
+    <w:lvl w:ilvl="4" w:tentative="1">
+      <w:start w:val="1"/>
+      <w:numFmt w:val="bullet"/>
+      <w:lvlText w:val=""/>
+      <w:lvlJc w:val="left"/>
+      <w:pPr>
+        <w:tabs>
+          <w:tab w:val="num" w:pos="3600"/>
+        </w:tabs>
+        <w:ind w:left="3600" w:hanging="360"/>
+      </w:pPr>
+      <w:rPr>
+        <w:rFonts w:ascii="Wingdings" w:hAnsi="Wingdings" w:hint="default"/>
+        <w:sz w:val="20"/>
+      </w:rPr>
+    </w:lvl>
+    <w:lvl w:ilvl="5" w:tentative="1">
+      <w:start w:val="1"/>
+      <w:numFmt w:val="bullet"/>
+      <w:lvlText w:val=""/>
+      <w:lvlJc w:val="left"/>
+      <w:pPr>
+        <w:tabs>
+          <w:tab w:val="num" w:pos="4320"/>
+        </w:tabs>
+        <w:ind w:left="4320" w:hanging="360"/>
+      </w:pPr>
+      <w:rPr>
+        <w:rFonts w:ascii="Wingdings" w:hAnsi="Wingdings" w:hint="default"/>
+        <w:sz w:val="20"/>
+      </w:rPr>
+    </w:lvl>
+    <w:lvl w:ilvl="6" w:tentative="1">
+      <w:start w:val="1"/>
+      <w:numFmt w:val="bullet"/>
+      <w:lvlText w:val=""/>
+      <w:lvlJc w:val="left"/>
+      <w:pPr>
+        <w:tabs>
+          <w:tab w:val="num" w:pos="5040"/>
+        </w:tabs>
+        <w:ind w:left="5040" w:hanging="360"/>
+      </w:pPr>
+      <w:rPr>
+        <w:rFonts w:ascii="Wingdings" w:hAnsi="Wingdings" w:hint="default"/>
+        <w:sz w:val="20"/>
+      </w:rPr>
+    </w:lvl>
+    <w:lvl w:ilvl="7" w:tentative="1">
+      <w:start w:val="1"/>
+      <w:numFmt w:val="bullet"/>
+      <w:lvlText w:val=""/>
+      <w:lvlJc w:val="left"/>
+      <w:pPr>
+        <w:tabs>
+          <w:tab w:val="num" w:pos="5760"/>
+        </w:tabs>
+        <w:ind w:left="5760" w:hanging="360"/>
+      </w:pPr>
+      <w:rPr>
+        <w:rFonts w:ascii="Wingdings" w:hAnsi="Wingdings" w:hint="default"/>
+        <w:sz w:val="20"/>
+      </w:rPr>
+    </w:lvl>
+    <w:lvl w:ilvl="8" w:tentative="1">
+      <w:start w:val="1"/>
+      <w:numFmt w:val="bullet"/>
+      <w:lvlText w:val=""/>
+      <w:lvlJc w:val="left"/>
+      <w:pPr>
+        <w:tabs>
+          <w:tab w:val="num" w:pos="6480"/>
+        </w:tabs>
+        <w:ind w:left="6480" w:hanging="360"/>
+      </w:pPr>
+      <w:rPr>
+        <w:rFonts w:ascii="Wingdings" w:hAnsi="Wingdings" w:hint="default"/>
+        <w:sz w:val="20"/>
+      </w:rPr>
+    </w:lvl>
+  </w:abstractNum>
+  <w:abstractNum w:abstractNumId="3" w15:restartNumberingAfterBreak="0">
+    <w:nsid w:val="3A1D18CF"/>
+    <w:multiLevelType w:val="multilevel"/>
+    <w:tmpl w:val="033C7B20"/>
+    <w:lvl w:ilvl="0">
+      <w:start w:val="1"/>
+      <w:numFmt w:val="bullet"/>
+      <w:lvlText w:val=""/>
+      <w:lvlJc w:val="left"/>
+      <w:pPr>
+        <w:tabs>
+          <w:tab w:val="num" w:pos="720"/>
+        </w:tabs>
+        <w:ind w:left="720" w:hanging="360"/>
+      </w:pPr>
+      <w:rPr>
+        <w:rFonts w:ascii="Symbol" w:hAnsi="Symbol" w:hint="default"/>
+        <w:sz w:val="20"/>
+      </w:rPr>
+    </w:lvl>
+    <w:lvl w:ilvl="1" w:tentative="1">
+      <w:start w:val="1"/>
+      <w:numFmt w:val="bullet"/>
+      <w:lvlText w:val="o"/>
+      <w:lvlJc w:val="left"/>
+      <w:pPr>
+        <w:tabs>
+          <w:tab w:val="num" w:pos="1440"/>
+        </w:tabs>
+        <w:ind w:left="1440" w:hanging="360"/>
+      </w:pPr>
+      <w:rPr>
+        <w:rFonts w:ascii="Courier New" w:hAnsi="Courier New" w:hint="default"/>
+        <w:sz w:val="20"/>
+      </w:rPr>
+    </w:lvl>
+    <w:lvl w:ilvl="2" w:tentative="1">
+      <w:start w:val="1"/>
+      <w:numFmt w:val="bullet"/>
+      <w:lvlText w:val=""/>
+      <w:lvlJc w:val="left"/>
+      <w:pPr>
+        <w:tabs>
+          <w:tab w:val="num" w:pos="2160"/>
+        </w:tabs>
+        <w:ind w:left="2160" w:hanging="360"/>
+      </w:pPr>
+      <w:rPr>
+        <w:rFonts w:ascii="Wingdings" w:hAnsi="Wingdings" w:hint="default"/>
+        <w:sz w:val="20"/>
+      </w:rPr>
+    </w:lvl>
+    <w:lvl w:ilvl="3" w:tentative="1">
+      <w:start w:val="1"/>
+      <w:numFmt w:val="bullet"/>
+      <w:lvlText w:val=""/>
+      <w:lvlJc w:val="left"/>
+      <w:pPr>
+        <w:tabs>
+          <w:tab w:val="num" w:pos="2880"/>
+        </w:tabs>
+        <w:ind w:left="2880" w:hanging="360"/>
+      </w:pPr>
+      <w:rPr>
+        <w:rFonts w:ascii="Wingdings" w:hAnsi="Wingdings" w:hint="default"/>
+        <w:sz w:val="20"/>
+      </w:rPr>
+    </w:lvl>
+    <w:lvl w:ilvl="4" w:tentative="1">
+      <w:start w:val="1"/>
+      <w:numFmt w:val="bullet"/>
+      <w:lvlText w:val=""/>
+      <w:lvlJc w:val="left"/>
+      <w:pPr>
+        <w:tabs>
+          <w:tab w:val="num" w:pos="3600"/>
+        </w:tabs>
+        <w:ind w:left="3600" w:hanging="360"/>
+      </w:pPr>
+      <w:rPr>
+        <w:rFonts w:ascii="Wingdings" w:hAnsi="Wingdings" w:hint="default"/>
+        <w:sz w:val="20"/>
+      </w:rPr>
+    </w:lvl>
+    <w:lvl w:ilvl="5" w:tentative="1">
+      <w:start w:val="1"/>
+      <w:numFmt w:val="bullet"/>
+      <w:lvlText w:val=""/>
+      <w:lvlJc w:val="left"/>
+      <w:pPr>
+        <w:tabs>
+          <w:tab w:val="num" w:pos="4320"/>
+        </w:tabs>
+        <w:ind w:left="4320" w:hanging="360"/>
+      </w:pPr>
+      <w:rPr>
+        <w:rFonts w:ascii="Wingdings" w:hAnsi="Wingdings" w:hint="default"/>
+        <w:sz w:val="20"/>
+      </w:rPr>
+    </w:lvl>
+    <w:lvl w:ilvl="6" w:tentative="1">
+      <w:start w:val="1"/>
+      <w:numFmt w:val="bullet"/>
+      <w:lvlText w:val=""/>
+      <w:lvlJc w:val="left"/>
+      <w:pPr>
+        <w:tabs>
+          <w:tab w:val="num" w:pos="5040"/>
+        </w:tabs>
+        <w:ind w:left="5040" w:hanging="360"/>
+      </w:pPr>
+      <w:rPr>
+        <w:rFonts w:ascii="Wingdings" w:hAnsi="Wingdings" w:hint="default"/>
+        <w:sz w:val="20"/>
+      </w:rPr>
+    </w:lvl>
+    <w:lvl w:ilvl="7" w:tentative="1">
+      <w:start w:val="1"/>
+      <w:numFmt w:val="bullet"/>
+      <w:lvlText w:val=""/>
+      <w:lvlJc w:val="left"/>
+      <w:pPr>
+        <w:tabs>
+          <w:tab w:val="num" w:pos="5760"/>
+        </w:tabs>
+        <w:ind w:left="5760" w:hanging="360"/>
+      </w:pPr>
+      <w:rPr>
+        <w:rFonts w:ascii="Wingdings" w:hAnsi="Wingdings" w:hint="default"/>
+        <w:sz w:val="20"/>
+      </w:rPr>
+    </w:lvl>
+    <w:lvl w:ilvl="8" w:tentative="1">
+      <w:start w:val="1"/>
+      <w:numFmt w:val="bullet"/>
+      <w:lvlText w:val=""/>
+      <w:lvlJc w:val="left"/>
+      <w:pPr>
+        <w:tabs>
+          <w:tab w:val="num" w:pos="6480"/>
+        </w:tabs>
+        <w:ind w:left="6480" w:hanging="360"/>
+      </w:pPr>
+      <w:rPr>
+        <w:rFonts w:ascii="Wingdings" w:hAnsi="Wingdings" w:hint="default"/>
+        <w:sz w:val="20"/>
+      </w:rPr>
+    </w:lvl>
+  </w:abstractNum>
+  <w:abstractNum w:abstractNumId="4" w15:restartNumberingAfterBreak="0">
+    <w:nsid w:val="459110FA"/>
+    <w:multiLevelType w:val="multilevel"/>
+    <w:tmpl w:val="182A40E8"/>
+    <w:lvl w:ilvl="0">
+      <w:start w:val="1"/>
+      <w:numFmt w:val="bullet"/>
+      <w:lvlText w:val=""/>
+      <w:lvlJc w:val="left"/>
+      <w:pPr>
+        <w:tabs>
+          <w:tab w:val="num" w:pos="720"/>
+        </w:tabs>
+        <w:ind w:left="720" w:hanging="360"/>
+      </w:pPr>
+      <w:rPr>
+        <w:rFonts w:ascii="Symbol" w:hAnsi="Symbol" w:hint="default"/>
+        <w:sz w:val="20"/>
+      </w:rPr>
+    </w:lvl>
+    <w:lvl w:ilvl="1" w:tentative="1">
+      <w:start w:val="1"/>
+      <w:numFmt w:val="bullet"/>
+      <w:lvlText w:val="o"/>
+      <w:lvlJc w:val="left"/>
+      <w:pPr>
+        <w:tabs>
+          <w:tab w:val="num" w:pos="1440"/>
+        </w:tabs>
+        <w:ind w:left="1440" w:hanging="360"/>
+      </w:pPr>
+      <w:rPr>
+        <w:rFonts w:ascii="Courier New" w:hAnsi="Courier New" w:hint="default"/>
+        <w:sz w:val="20"/>
+      </w:rPr>
+    </w:lvl>
+    <w:lvl w:ilvl="2" w:tentative="1">
+      <w:start w:val="1"/>
+      <w:numFmt w:val="bullet"/>
+      <w:lvlText w:val=""/>
+      <w:lvlJc w:val="left"/>
+      <w:pPr>
+        <w:tabs>
+          <w:tab w:val="num" w:pos="2160"/>
+        </w:tabs>
+        <w:ind w:left="2160" w:hanging="360"/>
+      </w:pPr>
+      <w:rPr>
+        <w:rFonts w:ascii="Wingdings" w:hAnsi="Wingdings" w:hint="default"/>
+        <w:sz w:val="20"/>
+      </w:rPr>
+    </w:lvl>
+    <w:lvl w:ilvl="3" w:tentative="1">
+      <w:start w:val="1"/>
+      <w:numFmt w:val="bullet"/>
+      <w:lvlText w:val=""/>
+      <w:lvlJc w:val="left"/>
+      <w:pPr>
+        <w:tabs>
+          <w:tab w:val="num" w:pos="2880"/>
+        </w:tabs>
+        <w:ind w:left="2880" w:hanging="360"/>
+      </w:pPr>
+      <w:rPr>
+        <w:rFonts w:ascii="Wingdings" w:hAnsi="Wingdings" w:hint="default"/>
+        <w:sz w:val="20"/>
+      </w:rPr>
+    </w:lvl>
+    <w:lvl w:ilvl="4" w:tentative="1">
+      <w:start w:val="1"/>
+      <w:numFmt w:val="bullet"/>
+      <w:lvlText w:val=""/>
+      <w:lvlJc w:val="left"/>
+      <w:pPr>
+        <w:tabs>
+          <w:tab w:val="num" w:pos="3600"/>
+        </w:tabs>
+        <w:ind w:left="3600" w:hanging="360"/>
+      </w:pPr>
+      <w:rPr>
+        <w:rFonts w:ascii="Wingdings" w:hAnsi="Wingdings" w:hint="default"/>
+        <w:sz w:val="20"/>
+      </w:rPr>
+    </w:lvl>
+    <w:lvl w:ilvl="5" w:tentative="1">
+      <w:start w:val="1"/>
+      <w:numFmt w:val="bullet"/>
+      <w:lvlText w:val=""/>
+      <w:lvlJc w:val="left"/>
+      <w:pPr>
+        <w:tabs>
+          <w:tab w:val="num" w:pos="4320"/>
+        </w:tabs>
+        <w:ind w:left="4320" w:hanging="360"/>
+      </w:pPr>
+      <w:rPr>
+        <w:rFonts w:ascii="Wingdings" w:hAnsi="Wingdings" w:hint="default"/>
+        <w:sz w:val="20"/>
+      </w:rPr>
+    </w:lvl>
+    <w:lvl w:ilvl="6" w:tentative="1">
+      <w:start w:val="1"/>
+      <w:numFmt w:val="bullet"/>
+      <w:lvlText w:val=""/>
+      <w:lvlJc w:val="left"/>
+      <w:pPr>
+        <w:tabs>
+          <w:tab w:val="num" w:pos="5040"/>
+        </w:tabs>
+        <w:ind w:left="5040" w:hanging="360"/>
+      </w:pPr>
+      <w:rPr>
+        <w:rFonts w:ascii="Wingdings" w:hAnsi="Wingdings" w:hint="default"/>
+        <w:sz w:val="20"/>
+      </w:rPr>
+    </w:lvl>
+    <w:lvl w:ilvl="7" w:tentative="1">
+      <w:start w:val="1"/>
+      <w:numFmt w:val="bullet"/>
+      <w:lvlText w:val=""/>
+      <w:lvlJc w:val="left"/>
+      <w:pPr>
+        <w:tabs>
+          <w:tab w:val="num" w:pos="5760"/>
+        </w:tabs>
+        <w:ind w:left="5760" w:hanging="360"/>
+      </w:pPr>
+      <w:rPr>
+        <w:rFonts w:ascii="Wingdings" w:hAnsi="Wingdings" w:hint="default"/>
+        <w:sz w:val="20"/>
+      </w:rPr>
+    </w:lvl>
+    <w:lvl w:ilvl="8" w:tentative="1">
+      <w:start w:val="1"/>
+      <w:numFmt w:val="bullet"/>
+      <w:lvlText w:val=""/>
+      <w:lvlJc w:val="left"/>
+      <w:pPr>
+        <w:tabs>
+          <w:tab w:val="num" w:pos="6480"/>
+        </w:tabs>
+        <w:ind w:left="6480" w:hanging="360"/>
+      </w:pPr>
+      <w:rPr>
+        <w:rFonts w:ascii="Wingdings" w:hAnsi="Wingdings" w:hint="default"/>
+        <w:sz w:val="20"/>
+      </w:rPr>
+    </w:lvl>
+  </w:abstractNum>
+  <w:abstractNum w:abstractNumId="5" w15:restartNumberingAfterBreak="0">
+    <w:nsid w:val="4B762491"/>
+    <w:multiLevelType w:val="multilevel"/>
+    <w:tmpl w:val="1CAA2846"/>
+    <w:lvl w:ilvl="0">
+      <w:start w:val="1"/>
+      <w:numFmt w:val="bullet"/>
+      <w:lvlText w:val=""/>
+      <w:lvlJc w:val="left"/>
+      <w:pPr>
+        <w:tabs>
+          <w:tab w:val="num" w:pos="720"/>
+        </w:tabs>
+        <w:ind w:left="720" w:hanging="360"/>
+      </w:pPr>
+      <w:rPr>
+        <w:rFonts w:ascii="Symbol" w:hAnsi="Symbol" w:hint="default"/>
+        <w:sz w:val="20"/>
+      </w:rPr>
+    </w:lvl>
+    <w:lvl w:ilvl="1" w:tentative="1">
+      <w:start w:val="1"/>
+      <w:numFmt w:val="bullet"/>
+      <w:lvlText w:val="o"/>
+      <w:lvlJc w:val="left"/>
+      <w:pPr>
+        <w:tabs>
+          <w:tab w:val="num" w:pos="1440"/>
+        </w:tabs>
+        <w:ind w:left="1440" w:hanging="360"/>
+      </w:pPr>
+      <w:rPr>
+        <w:rFonts w:ascii="Courier New" w:hAnsi="Courier New" w:hint="default"/>
+        <w:sz w:val="20"/>
+      </w:rPr>
+    </w:lvl>
+    <w:lvl w:ilvl="2" w:tentative="1">
+      <w:start w:val="1"/>
+      <w:numFmt w:val="bullet"/>
+      <w:lvlText w:val=""/>
+      <w:lvlJc w:val="left"/>
+      <w:pPr>
+        <w:tabs>
+          <w:tab w:val="num" w:pos="2160"/>
+        </w:tabs>
+        <w:ind w:left="2160" w:hanging="360"/>
+      </w:pPr>
+      <w:rPr>
+        <w:rFonts w:ascii="Wingdings" w:hAnsi="Wingdings" w:hint="default"/>
+        <w:sz w:val="20"/>
+      </w:rPr>
+    </w:lvl>
+    <w:lvl w:ilvl="3" w:tentative="1">
+      <w:start w:val="1"/>
+      <w:numFmt w:val="bullet"/>
+      <w:lvlText w:val=""/>
+      <w:lvlJc w:val="left"/>
+      <w:pPr>
+        <w:tabs>
+          <w:tab w:val="num" w:pos="2880"/>
+        </w:tabs>
+        <w:ind w:left="2880" w:hanging="360"/>
+      </w:pPr>
+      <w:rPr>
+        <w:rFonts w:ascii="Wingdings" w:hAnsi="Wingdings" w:hint="default"/>
+        <w:sz w:val="20"/>
+      </w:rPr>
+    </w:lvl>
+    <w:lvl w:ilvl="4" w:tentative="1">
+      <w:start w:val="1"/>
+      <w:numFmt w:val="bullet"/>
+      <w:lvlText w:val=""/>
+      <w:lvlJc w:val="left"/>
+      <w:pPr>
+        <w:tabs>
+          <w:tab w:val="num" w:pos="3600"/>
+        </w:tabs>
+        <w:ind w:left="3600" w:hanging="360"/>
+      </w:pPr>
+      <w:rPr>
+        <w:rFonts w:ascii="Wingdings" w:hAnsi="Wingdings" w:hint="default"/>
+        <w:sz w:val="20"/>
+      </w:rPr>
+    </w:lvl>
+    <w:lvl w:ilvl="5" w:tentative="1">
+      <w:start w:val="1"/>
+      <w:numFmt w:val="bullet"/>
+      <w:lvlText w:val=""/>
+      <w:lvlJc w:val="left"/>
+      <w:pPr>
+        <w:tabs>
+          <w:tab w:val="num" w:pos="4320"/>
+        </w:tabs>
+        <w:ind w:left="4320" w:hanging="360"/>
+      </w:pPr>
+      <w:rPr>
+        <w:rFonts w:ascii="Wingdings" w:hAnsi="Wingdings" w:hint="default"/>
+        <w:sz w:val="20"/>
+      </w:rPr>
+    </w:lvl>
+    <w:lvl w:ilvl="6" w:tentative="1">
+      <w:start w:val="1"/>
+      <w:numFmt w:val="bullet"/>
+      <w:lvlText w:val=""/>
+      <w:lvlJc w:val="left"/>
+      <w:pPr>
+        <w:tabs>
+          <w:tab w:val="num" w:pos="5040"/>
+        </w:tabs>
+        <w:ind w:left="5040" w:hanging="360"/>
+      </w:pPr>
+      <w:rPr>
+        <w:rFonts w:ascii="Wingdings" w:hAnsi="Wingdings" w:hint="default"/>
+        <w:sz w:val="20"/>
+      </w:rPr>
+    </w:lvl>
+    <w:lvl w:ilvl="7" w:tentative="1">
+      <w:start w:val="1"/>
+      <w:numFmt w:val="bullet"/>
+      <w:lvlText w:val=""/>
+      <w:lvlJc w:val="left"/>
+      <w:pPr>
+        <w:tabs>
+          <w:tab w:val="num" w:pos="5760"/>
+        </w:tabs>
+        <w:ind w:left="5760" w:hanging="360"/>
+      </w:pPr>
+      <w:rPr>
+        <w:rFonts w:ascii="Wingdings" w:hAnsi="Wingdings" w:hint="default"/>
+        <w:sz w:val="20"/>
+      </w:rPr>
+    </w:lvl>
+    <w:lvl w:ilvl="8" w:tentative="1">
+      <w:start w:val="1"/>
+      <w:numFmt w:val="bullet"/>
+      <w:lvlText w:val=""/>
+      <w:lvlJc w:val="left"/>
+      <w:pPr>
+        <w:tabs>
+          <w:tab w:val="num" w:pos="6480"/>
+        </w:tabs>
+        <w:ind w:left="6480" w:hanging="360"/>
+      </w:pPr>
+      <w:rPr>
+        <w:rFonts w:ascii="Wingdings" w:hAnsi="Wingdings" w:hint="default"/>
+        <w:sz w:val="20"/>
+      </w:rPr>
+    </w:lvl>
+  </w:abstractNum>
+  <w:abstractNum w:abstractNumId="6" w15:restartNumberingAfterBreak="0">
+    <w:nsid w:val="5DB36F26"/>
+    <w:multiLevelType w:val="multilevel"/>
+    <w:tmpl w:val="97A656E2"/>
+    <w:lvl w:ilvl="0">
+      <w:start w:val="1"/>
+      <w:numFmt w:val="bullet"/>
+      <w:lvlText w:val=""/>
+      <w:lvlJc w:val="left"/>
+      <w:pPr>
+        <w:tabs>
+          <w:tab w:val="num" w:pos="720"/>
+        </w:tabs>
+        <w:ind w:left="720" w:hanging="360"/>
+      </w:pPr>
+      <w:rPr>
+        <w:rFonts w:ascii="Symbol" w:hAnsi="Symbol" w:hint="default"/>
+        <w:sz w:val="20"/>
+      </w:rPr>
+    </w:lvl>
+    <w:lvl w:ilvl="1" w:tentative="1">
+      <w:start w:val="1"/>
+      <w:numFmt w:val="bullet"/>
+      <w:lvlText w:val="o"/>
+      <w:lvlJc w:val="left"/>
+      <w:pPr>
+        <w:tabs>
+          <w:tab w:val="num" w:pos="1440"/>
+        </w:tabs>
+        <w:ind w:left="1440" w:hanging="360"/>
+      </w:pPr>
+      <w:rPr>
+        <w:rFonts w:ascii="Courier New" w:hAnsi="Courier New" w:hint="default"/>
+        <w:sz w:val="20"/>
+      </w:rPr>
+    </w:lvl>
+    <w:lvl w:ilvl="2" w:tentative="1">
+      <w:start w:val="1"/>
+      <w:numFmt w:val="bullet"/>
+      <w:lvlText w:val=""/>
+      <w:lvlJc w:val="left"/>
+      <w:pPr>
+        <w:tabs>
+          <w:tab w:val="num" w:pos="2160"/>
+        </w:tabs>
+        <w:ind w:left="2160" w:hanging="360"/>
+      </w:pPr>
+      <w:rPr>
+        <w:rFonts w:ascii="Wingdings" w:hAnsi="Wingdings" w:hint="default"/>
+        <w:sz w:val="20"/>
+      </w:rPr>
+    </w:lvl>
+    <w:lvl w:ilvl="3" w:tentative="1">
+      <w:start w:val="1"/>
+      <w:numFmt w:val="bullet"/>
+      <w:lvlText w:val=""/>
+      <w:lvlJc w:val="left"/>
+      <w:pPr>
+        <w:tabs>
+          <w:tab w:val="num" w:pos="2880"/>
+        </w:tabs>
+        <w:ind w:left="2880" w:hanging="360"/>
+      </w:pPr>
+      <w:rPr>
+        <w:rFonts w:ascii="Wingdings" w:hAnsi="Wingdings" w:hint="default"/>
+        <w:sz w:val="20"/>
+      </w:rPr>
+    </w:lvl>
+    <w:lvl w:ilvl="4" w:tentative="1">
+      <w:start w:val="1"/>
+      <w:numFmt w:val="bullet"/>
+      <w:lvlText w:val=""/>
+      <w:lvlJc w:val="left"/>
+      <w:pPr>
+        <w:tabs>
+          <w:tab w:val="num" w:pos="3600"/>
+        </w:tabs>
+        <w:ind w:left="3600" w:hanging="360"/>
+      </w:pPr>
+      <w:rPr>
+        <w:rFonts w:ascii="Wingdings" w:hAnsi="Wingdings" w:hint="default"/>
+        <w:sz w:val="20"/>
+      </w:rPr>
+    </w:lvl>
+    <w:lvl w:ilvl="5" w:tentative="1">
+      <w:start w:val="1"/>
+      <w:numFmt w:val="bullet"/>
+      <w:lvlText w:val=""/>
+      <w:lvlJc w:val="left"/>
+      <w:pPr>
+        <w:tabs>
+          <w:tab w:val="num" w:pos="4320"/>
+        </w:tabs>
+        <w:ind w:left="4320" w:hanging="360"/>
+      </w:pPr>
+      <w:rPr>
+        <w:rFonts w:ascii="Wingdings" w:hAnsi="Wingdings" w:hint="default"/>
+        <w:sz w:val="20"/>
+      </w:rPr>
+    </w:lvl>
+    <w:lvl w:ilvl="6" w:tentative="1">
+      <w:start w:val="1"/>
+      <w:numFmt w:val="bullet"/>
+      <w:lvlText w:val=""/>
+      <w:lvlJc w:val="left"/>
+      <w:pPr>
+        <w:tabs>
+          <w:tab w:val="num" w:pos="5040"/>
+        </w:tabs>
+        <w:ind w:left="5040" w:hanging="360"/>
+      </w:pPr>
+      <w:rPr>
+        <w:rFonts w:ascii="Wingdings" w:hAnsi="Wingdings" w:hint="default"/>
+        <w:sz w:val="20"/>
+      </w:rPr>
+    </w:lvl>
+    <w:lvl w:ilvl="7" w:tentative="1">
+      <w:start w:val="1"/>
+      <w:numFmt w:val="bullet"/>
+      <w:lvlText w:val=""/>
+      <w:lvlJc w:val="left"/>
+      <w:pPr>
+        <w:tabs>
+          <w:tab w:val="num" w:pos="5760"/>
+        </w:tabs>
+        <w:ind w:left="5760" w:hanging="360"/>
+      </w:pPr>
+      <w:rPr>
+        <w:rFonts w:ascii="Wingdings" w:hAnsi="Wingdings" w:hint="default"/>
+        <w:sz w:val="20"/>
+      </w:rPr>
+    </w:lvl>
+    <w:lvl w:ilvl="8" w:tentative="1">
+      <w:start w:val="1"/>
+      <w:numFmt w:val="bullet"/>
+      <w:lvlText w:val=""/>
+      <w:lvlJc w:val="left"/>
+      <w:pPr>
+        <w:tabs>
+          <w:tab w:val="num" w:pos="6480"/>
+        </w:tabs>
+        <w:ind w:left="6480" w:hanging="360"/>
+      </w:pPr>
+      <w:rPr>
+        <w:rFonts w:ascii="Wingdings" w:hAnsi="Wingdings" w:hint="default"/>
+        <w:sz w:val="20"/>
+      </w:rPr>
+    </w:lvl>
+  </w:abstractNum>
+  <w:abstractNum w:abstractNumId="7" w15:restartNumberingAfterBreak="0">
+    <w:nsid w:val="62B4566D"/>
+    <w:multiLevelType w:val="multilevel"/>
+    <w:tmpl w:val="BEA0AA16"/>
+    <w:lvl w:ilvl="0">
+      <w:start w:val="1"/>
+      <w:numFmt w:val="bullet"/>
+      <w:lvlText w:val=""/>
+      <w:lvlJc w:val="left"/>
+      <w:pPr>
+        <w:tabs>
+          <w:tab w:val="num" w:pos="720"/>
+        </w:tabs>
+        <w:ind w:left="720" w:hanging="360"/>
+      </w:pPr>
+      <w:rPr>
+        <w:rFonts w:ascii="Symbol" w:hAnsi="Symbol" w:hint="default"/>
+        <w:sz w:val="20"/>
+      </w:rPr>
+    </w:lvl>
+    <w:lvl w:ilvl="1" w:tentative="1">
+      <w:start w:val="1"/>
+      <w:numFmt w:val="bullet"/>
+      <w:lvlText w:val="o"/>
+      <w:lvlJc w:val="left"/>
+      <w:pPr>
+        <w:tabs>
+          <w:tab w:val="num" w:pos="1440"/>
+        </w:tabs>
+        <w:ind w:left="1440" w:hanging="360"/>
+      </w:pPr>
+      <w:rPr>
+        <w:rFonts w:ascii="Courier New" w:hAnsi="Courier New" w:hint="default"/>
+        <w:sz w:val="20"/>
+      </w:rPr>
+    </w:lvl>
+    <w:lvl w:ilvl="2" w:tentative="1">
+      <w:start w:val="1"/>
+      <w:numFmt w:val="bullet"/>
+      <w:lvlText w:val=""/>
+      <w:lvlJc w:val="left"/>
+      <w:pPr>
+        <w:tabs>
+          <w:tab w:val="num" w:pos="2160"/>
+        </w:tabs>
+        <w:ind w:left="2160" w:hanging="360"/>
+      </w:pPr>
+      <w:rPr>
+        <w:rFonts w:ascii="Wingdings" w:hAnsi="Wingdings" w:hint="default"/>
+        <w:sz w:val="20"/>
+      </w:rPr>
+    </w:lvl>
+    <w:lvl w:ilvl="3" w:tentative="1">
+      <w:start w:val="1"/>
+      <w:numFmt w:val="bullet"/>
+      <w:lvlText w:val=""/>
+      <w:lvlJc w:val="left"/>
+      <w:pPr>
+        <w:tabs>
+          <w:tab w:val="num" w:pos="2880"/>
+        </w:tabs>
+        <w:ind w:left="2880" w:hanging="360"/>
+      </w:pPr>
+      <w:rPr>
+        <w:rFonts w:ascii="Wingdings" w:hAnsi="Wingdings" w:hint="default"/>
+        <w:sz w:val="20"/>
+      </w:rPr>
+    </w:lvl>
+    <w:lvl w:ilvl="4" w:tentative="1">
+      <w:start w:val="1"/>
+      <w:numFmt w:val="bullet"/>
+      <w:lvlText w:val=""/>
+      <w:lvlJc w:val="left"/>
+      <w:pPr>
+        <w:tabs>
+          <w:tab w:val="num" w:pos="3600"/>
+        </w:tabs>
+        <w:ind w:left="3600" w:hanging="360"/>
+      </w:pPr>
+      <w:rPr>
+        <w:rFonts w:ascii="Wingdings" w:hAnsi="Wingdings" w:hint="default"/>
+        <w:sz w:val="20"/>
+      </w:rPr>
+    </w:lvl>
+    <w:lvl w:ilvl="5" w:tentative="1">
+      <w:start w:val="1"/>
+      <w:numFmt w:val="bullet"/>
+      <w:lvlText w:val=""/>
+      <w:lvlJc w:val="left"/>
+      <w:pPr>
+        <w:tabs>
+          <w:tab w:val="num" w:pos="4320"/>
+        </w:tabs>
+        <w:ind w:left="4320" w:hanging="360"/>
+      </w:pPr>
+      <w:rPr>
+        <w:rFonts w:ascii="Wingdings" w:hAnsi="Wingdings" w:hint="default"/>
+        <w:sz w:val="20"/>
+      </w:rPr>
+    </w:lvl>
+    <w:lvl w:ilvl="6" w:tentative="1">
+      <w:start w:val="1"/>
+      <w:numFmt w:val="bullet"/>
+      <w:lvlText w:val=""/>
+      <w:lvlJc w:val="left"/>
+      <w:pPr>
+        <w:tabs>
+          <w:tab w:val="num" w:pos="5040"/>
+        </w:tabs>
+        <w:ind w:left="5040" w:hanging="360"/>
+      </w:pPr>
+      <w:rPr>
+        <w:rFonts w:ascii="Wingdings" w:hAnsi="Wingdings" w:hint="default"/>
+        <w:sz w:val="20"/>
+      </w:rPr>
+    </w:lvl>
+    <w:lvl w:ilvl="7" w:tentative="1">
+      <w:start w:val="1"/>
+      <w:numFmt w:val="bullet"/>
+      <w:lvlText w:val=""/>
+      <w:lvlJc w:val="left"/>
+      <w:pPr>
+        <w:tabs>
+          <w:tab w:val="num" w:pos="5760"/>
+        </w:tabs>
+        <w:ind w:left="5760" w:hanging="360"/>
+      </w:pPr>
+      <w:rPr>
+        <w:rFonts w:ascii="Wingdings" w:hAnsi="Wingdings" w:hint="default"/>
+        <w:sz w:val="20"/>
+      </w:rPr>
+    </w:lvl>
+    <w:lvl w:ilvl="8" w:tentative="1">
+      <w:start w:val="1"/>
+      <w:numFmt w:val="bullet"/>
+      <w:lvlText w:val=""/>
+      <w:lvlJc w:val="left"/>
+      <w:pPr>
+        <w:tabs>
+          <w:tab w:val="num" w:pos="6480"/>
+        </w:tabs>
+        <w:ind w:left="6480" w:hanging="360"/>
+      </w:pPr>
+      <w:rPr>
+        <w:rFonts w:ascii="Wingdings" w:hAnsi="Wingdings" w:hint="default"/>
+        <w:sz w:val="20"/>
+      </w:rPr>
+    </w:lvl>
+  </w:abstractNum>
+  <w:abstractNum w:abstractNumId="8" w15:restartNumberingAfterBreak="0">
+    <w:nsid w:val="71910F95"/>
+    <w:multiLevelType w:val="multilevel"/>
+    <w:tmpl w:val="D0AC1172"/>
+    <w:lvl w:ilvl="0">
+      <w:start w:val="1"/>
+      <w:numFmt w:val="bullet"/>
+      <w:lvlText w:val=""/>
+      <w:lvlJc w:val="left"/>
+      <w:pPr>
+        <w:tabs>
+          <w:tab w:val="num" w:pos="720"/>
+        </w:tabs>
+        <w:ind w:left="720" w:hanging="360"/>
+      </w:pPr>
+      <w:rPr>
+        <w:rFonts w:ascii="Symbol" w:hAnsi="Symbol" w:hint="default"/>
+        <w:sz w:val="20"/>
+      </w:rPr>
+    </w:lvl>
+    <w:lvl w:ilvl="1" w:tentative="1">
+      <w:start w:val="1"/>
+      <w:numFmt w:val="bullet"/>
+      <w:lvlText w:val="o"/>
+      <w:lvlJc w:val="left"/>
+      <w:pPr>
+        <w:tabs>
+          <w:tab w:val="num" w:pos="1440"/>
+        </w:tabs>
+        <w:ind w:left="1440" w:hanging="360"/>
+      </w:pPr>
+      <w:rPr>
+        <w:rFonts w:ascii="Courier New" w:hAnsi="Courier New" w:hint="default"/>
+        <w:sz w:val="20"/>
+      </w:rPr>
+    </w:lvl>
+    <w:lvl w:ilvl="2" w:tentative="1">
+      <w:start w:val="1"/>
+      <w:numFmt w:val="bullet"/>
+      <w:lvlText w:val=""/>
+      <w:lvlJc w:val="left"/>
+      <w:pPr>
+        <w:tabs>
+          <w:tab w:val="num" w:pos="2160"/>
+        </w:tabs>
+        <w:ind w:left="2160" w:hanging="360"/>
+      </w:pPr>
+      <w:rPr>
+        <w:rFonts w:ascii="Wingdings" w:hAnsi="Wingdings" w:hint="default"/>
+        <w:sz w:val="20"/>
+      </w:rPr>
+    </w:lvl>
+    <w:lvl w:ilvl="3" w:tentative="1">
+      <w:start w:val="1"/>
+      <w:numFmt w:val="bullet"/>
+      <w:lvlText w:val=""/>
+      <w:lvlJc w:val="left"/>
+      <w:pPr>
+        <w:tabs>
+          <w:tab w:val="num" w:pos="2880"/>
+        </w:tabs>
+        <w:ind w:left="2880" w:hanging="360"/>
+      </w:pPr>
+      <w:rPr>
+        <w:rFonts w:ascii="Wingdings" w:hAnsi="Wingdings" w:hint="default"/>
+        <w:sz w:val="20"/>
+      </w:rPr>
+    </w:lvl>
+    <w:lvl w:ilvl="4" w:tentative="1">
+      <w:start w:val="1"/>
+      <w:numFmt w:val="bullet"/>
+      <w:lvlText w:val=""/>
+      <w:lvlJc w:val="left"/>
+      <w:pPr>
+        <w:tabs>
+          <w:tab w:val="num" w:pos="3600"/>
+        </w:tabs>
+        <w:ind w:left="3600" w:hanging="360"/>
+      </w:pPr>
+      <w:rPr>
+        <w:rFonts w:ascii="Wingdings" w:hAnsi="Wingdings" w:hint="default"/>
+        <w:sz w:val="20"/>
+      </w:rPr>
+    </w:lvl>
+    <w:lvl w:ilvl="5" w:tentative="1">
+      <w:start w:val="1"/>
+      <w:numFmt w:val="bullet"/>
+      <w:lvlText w:val=""/>
+      <w:lvlJc w:val="left"/>
+      <w:pPr>
+        <w:tabs>
+          <w:tab w:val="num" w:pos="4320"/>
+        </w:tabs>
+        <w:ind w:left="4320" w:hanging="360"/>
+      </w:pPr>
+      <w:rPr>
+        <w:rFonts w:ascii="Wingdings" w:hAnsi="Wingdings" w:hint="default"/>
+        <w:sz w:val="20"/>
+      </w:rPr>
+    </w:lvl>
+    <w:lvl w:ilvl="6" w:tentative="1">
+      <w:start w:val="1"/>
+      <w:numFmt w:val="bullet"/>
+      <w:lvlText w:val=""/>
+      <w:lvlJc w:val="left"/>
+      <w:pPr>
+        <w:tabs>
+          <w:tab w:val="num" w:pos="5040"/>
+        </w:tabs>
+        <w:ind w:left="5040" w:hanging="360"/>
+      </w:pPr>
+      <w:rPr>
+        <w:rFonts w:ascii="Wingdings" w:hAnsi="Wingdings" w:hint="default"/>
+        <w:sz w:val="20"/>
+      </w:rPr>
+    </w:lvl>
+    <w:lvl w:ilvl="7" w:tentative="1">
+      <w:start w:val="1"/>
+      <w:numFmt w:val="bullet"/>
+      <w:lvlText w:val=""/>
+      <w:lvlJc w:val="left"/>
+      <w:pPr>
+        <w:tabs>
+          <w:tab w:val="num" w:pos="5760"/>
+        </w:tabs>
+        <w:ind w:left="5760" w:hanging="360"/>
+      </w:pPr>
+      <w:rPr>
+        <w:rFonts w:ascii="Wingdings" w:hAnsi="Wingdings" w:hint="default"/>
+        <w:sz w:val="20"/>
+      </w:rPr>
+    </w:lvl>
+    <w:lvl w:ilvl="8" w:tentative="1">
+      <w:start w:val="1"/>
+      <w:numFmt w:val="bullet"/>
+      <w:lvlText w:val=""/>
+      <w:lvlJc w:val="left"/>
+      <w:pPr>
+        <w:tabs>
+          <w:tab w:val="num" w:pos="6480"/>
+        </w:tabs>
+        <w:ind w:left="6480" w:hanging="360"/>
+      </w:pPr>
+      <w:rPr>
+        <w:rFonts w:ascii="Wingdings" w:hAnsi="Wingdings" w:hint="default"/>
+        <w:sz w:val="20"/>
+      </w:rPr>
+    </w:lvl>
+  </w:abstractNum>
+  <w:abstractNum w:abstractNumId="9" w15:restartNumberingAfterBreak="0">
+    <w:nsid w:val="7E6949AA"/>
+    <w:multiLevelType w:val="multilevel"/>
+    <w:tmpl w:val="6D4A12DE"/>
+    <w:lvl w:ilvl="0">
+      <w:start w:val="1"/>
+      <w:numFmt w:val="bullet"/>
+      <w:lvlText w:val=""/>
+      <w:lvlJc w:val="left"/>
+      <w:pPr>
+        <w:tabs>
+          <w:tab w:val="num" w:pos="720"/>
+        </w:tabs>
+        <w:ind w:left="720" w:hanging="360"/>
+      </w:pPr>
+      <w:rPr>
+        <w:rFonts w:ascii="Symbol" w:hAnsi="Symbol" w:hint="default"/>
+        <w:sz w:val="20"/>
+      </w:rPr>
+    </w:lvl>
+    <w:lvl w:ilvl="1" w:tentative="1">
+      <w:start w:val="1"/>
+      <w:numFmt w:val="bullet"/>
+      <w:lvlText w:val="o"/>
+      <w:lvlJc w:val="left"/>
+      <w:pPr>
+        <w:tabs>
+          <w:tab w:val="num" w:pos="1440"/>
+        </w:tabs>
+        <w:ind w:left="1440" w:hanging="360"/>
+      </w:pPr>
+      <w:rPr>
+        <w:rFonts w:ascii="Courier New" w:hAnsi="Courier New" w:hint="default"/>
+        <w:sz w:val="20"/>
+      </w:rPr>
+    </w:lvl>
+    <w:lvl w:ilvl="2" w:tentative="1">
+      <w:start w:val="1"/>
+      <w:numFmt w:val="bullet"/>
+      <w:lvlText w:val=""/>
+      <w:lvlJc w:val="left"/>
+      <w:pPr>
+        <w:tabs>
+          <w:tab w:val="num" w:pos="2160"/>
+        </w:tabs>
+        <w:ind w:left="2160" w:hanging="360"/>
+      </w:pPr>
+      <w:rPr>
+        <w:rFonts w:ascii="Wingdings" w:hAnsi="Wingdings" w:hint="default"/>
+        <w:sz w:val="20"/>
+      </w:rPr>
+    </w:lvl>
+    <w:lvl w:ilvl="3" w:tentative="1">
+      <w:start w:val="1"/>
+      <w:numFmt w:val="bullet"/>
+      <w:lvlText w:val=""/>
+      <w:lvlJc w:val="left"/>
+      <w:pPr>
+        <w:tabs>
+          <w:tab w:val="num" w:pos="2880"/>
+        </w:tabs>
+        <w:ind w:left="2880" w:hanging="360"/>
+      </w:pPr>
+      <w:rPr>
+        <w:rFonts w:ascii="Wingdings" w:hAnsi="Wingdings" w:hint="default"/>
+        <w:sz w:val="20"/>
+      </w:rPr>
+    </w:lvl>
+    <w:lvl w:ilvl="4" w:tentative="1">
+      <w:start w:val="1"/>
+      <w:numFmt w:val="bullet"/>
+      <w:lvlText w:val=""/>
+      <w:lvlJc w:val="left"/>
+      <w:pPr>
+        <w:tabs>
+          <w:tab w:val="num" w:pos="3600"/>
+        </w:tabs>
+        <w:ind w:left="3600" w:hanging="360"/>
+      </w:pPr>
+      <w:rPr>
+        <w:rFonts w:ascii="Wingdings" w:hAnsi="Wingdings" w:hint="default"/>
+        <w:sz w:val="20"/>
+      </w:rPr>
+    </w:lvl>
+    <w:lvl w:ilvl="5" w:tentative="1">
+      <w:start w:val="1"/>
+      <w:numFmt w:val="bullet"/>
+      <w:lvlText w:val=""/>
+      <w:lvlJc w:val="left"/>
+      <w:pPr>
+        <w:tabs>
+          <w:tab w:val="num" w:pos="4320"/>
+        </w:tabs>
+        <w:ind w:left="4320" w:hanging="360"/>
+      </w:pPr>
+      <w:rPr>
+        <w:rFonts w:ascii="Wingdings" w:hAnsi="Wingdings" w:hint="default"/>
+        <w:sz w:val="20"/>
+      </w:rPr>
+    </w:lvl>
+    <w:lvl w:ilvl="6" w:tentative="1">
+      <w:start w:val="1"/>
+      <w:numFmt w:val="bullet"/>
+      <w:lvlText w:val=""/>
+      <w:lvlJc w:val="left"/>
+      <w:pPr>
+        <w:tabs>
+          <w:tab w:val="num" w:pos="5040"/>
+        </w:tabs>
+        <w:ind w:left="5040" w:hanging="360"/>
+      </w:pPr>
+      <w:rPr>
+        <w:rFonts w:ascii="Wingdings" w:hAnsi="Wingdings" w:hint="default"/>
+        <w:sz w:val="20"/>
+      </w:rPr>
+    </w:lvl>
+    <w:lvl w:ilvl="7" w:tentative="1">
+      <w:start w:val="1"/>
+      <w:numFmt w:val="bullet"/>
+      <w:lvlText w:val=""/>
+      <w:lvlJc w:val="left"/>
+      <w:pPr>
+        <w:tabs>
+          <w:tab w:val="num" w:pos="5760"/>
+        </w:tabs>
+        <w:ind w:left="5760" w:hanging="360"/>
+      </w:pPr>
+      <w:rPr>
+        <w:rFonts w:ascii="Wingdings" w:hAnsi="Wingdings" w:hint="default"/>
+        <w:sz w:val="20"/>
+      </w:rPr>
+    </w:lvl>
+    <w:lvl w:ilvl="8" w:tentative="1">
+      <w:start w:val="1"/>
+      <w:numFmt w:val="bullet"/>
+      <w:lvlText w:val=""/>
+      <w:lvlJc w:val="left"/>
+      <w:pPr>
+        <w:tabs>
+          <w:tab w:val="num" w:pos="6480"/>
+        </w:tabs>
+        <w:ind w:left="6480" w:hanging="360"/>
+      </w:pPr>
+      <w:rPr>
+        <w:rFonts w:ascii="Wingdings" w:hAnsi="Wingdings" w:hint="default"/>
+        <w:sz w:val="20"/>
+      </w:rPr>
+    </w:lvl>
+  </w:abstractNum>
+  <w:num w:numId="1" w16cid:durableId="558396811">
+    <w:abstractNumId w:val="9"/>
+  </w:num>
+  <w:num w:numId="2" w16cid:durableId="211817811">
+    <w:abstractNumId w:val="3"/>
+  </w:num>
+  <w:num w:numId="3" w16cid:durableId="719355703">
+    <w:abstractNumId w:val="5"/>
+  </w:num>
+  <w:num w:numId="4" w16cid:durableId="948388867">
+    <w:abstractNumId w:val="4"/>
+  </w:num>
+  <w:num w:numId="5" w16cid:durableId="1625841280">
+    <w:abstractNumId w:val="8"/>
+  </w:num>
+  <w:num w:numId="6" w16cid:durableId="48769155">
+    <w:abstractNumId w:val="1"/>
+  </w:num>
+  <w:num w:numId="7" w16cid:durableId="1251280644">
+    <w:abstractNumId w:val="7"/>
+  </w:num>
+  <w:num w:numId="8" w16cid:durableId="1511404573">
+    <w:abstractNumId w:val="6"/>
+  </w:num>
+  <w:num w:numId="9" w16cid:durableId="510605326">
+    <w:abstractNumId w:val="0"/>
+  </w:num>
+  <w:num w:numId="10" w16cid:durableId="849680203">
+    <w:abstractNumId w:val="2"/>
+  </w:num>
+</w:numbering>
 </file>
 
 <file path=word/styles.xml><?xml version="1.0" encoding="utf-8"?>
@@ -834,7 +4793,6 @@
   <w:style w:type="character" w:default="1" w:styleId="Fuentedeprrafopredeter">
     <w:name w:val="Default Paragraph Font"/>
     <w:uiPriority w:val="1"/>
-    <w:semiHidden/>
     <w:unhideWhenUsed/>
   </w:style>
   <w:style w:type="table" w:default="1" w:styleId="Tablanormal">

</xml_diff>